<commit_message>
Enhance Doc0 form, validation and completeness
Add server-side completeness check for document 0 (isDoc0Complete) parsing stored JSON and verifying required fields (date, title, applicant_name, employee_type, current_position, at least one chk, course_code, course_name, academic_year) and a hasValue helper; replace previous anyMatch checks with this method. Update applicant/admin Doc0 templates: rename full_name -> applicant_name, add academic title options, add course fields (code, name, academic year), and adjust selected/current-position logic. Add client-side enhancements: auto-update title options based on current_position, update form validation to include course fields, and keep preview initialization. Update docx template binary and add uploaded docx files for sample academics (uploads for ids 13 and 14).
</commit_message>
<xml_diff>
--- a/HRCP-KKU-Academic/src/main/resources/templates/docx/doc_0.docx
+++ b/HRCP-KKU-Academic/src/main/resources/templates/docx/doc_0.docx
@@ -28,7 +28,7 @@
           <w:lang w:val="en-US"/>
         </w:rPr>
         <w:drawing>
-          <wp:anchor distT="0" distB="0" distL="114300" distR="114300" simplePos="0" relativeHeight="251659264" behindDoc="0" locked="1" layoutInCell="1" allowOverlap="1" wp14:anchorId="68A6F703" wp14:editId="781C7EDE">
+          <wp:anchor distT="0" distB="0" distL="114300" distR="114300" simplePos="0" relativeHeight="251659264" behindDoc="0" locked="1" layoutInCell="1" allowOverlap="1" wp14:anchorId="68A6F703" wp14:editId="7992DAA0">
             <wp:simplePos x="0" y="0"/>
             <wp:positionH relativeFrom="margin">
               <wp:posOffset>0</wp:posOffset>
@@ -617,7 +617,7 @@
           <w:szCs w:val="32"/>
           <w:lang w:eastAsia="en-GB"/>
         </w:rPr>
-        <w:t>full_name</w:t>
+        <w:t>applicant_name</w:t>
       </w:r>
       <w:r>
         <w:rPr>
@@ -2111,7 +2111,7 @@
     <w:lsdException w:name="Unresolved Mention" w:semiHidden="1" w:unhideWhenUsed="1"/>
     <w:lsdException w:name="Smart Link" w:semiHidden="1" w:unhideWhenUsed="1"/>
   </w:latentStyles>
-  <w:style w:type="paragraph" w:default="1" w:styleId="Normal">
+  <w:style w:type="paragraph" w:default="1" w:styleId="a">
     <w:name w:val="Normal"/>
     <w:qFormat/>
     <w:rsid w:val="005D52E8"/>
@@ -2120,11 +2120,11 @@
       <w:szCs w:val="24"/>
     </w:rPr>
   </w:style>
-  <w:style w:type="paragraph" w:styleId="Heading1">
+  <w:style w:type="paragraph" w:styleId="1">
     <w:name w:val="heading 1"/>
-    <w:basedOn w:val="Normal"/>
-    <w:next w:val="Normal"/>
-    <w:link w:val="Heading1Char"/>
+    <w:basedOn w:val="a"/>
+    <w:next w:val="a"/>
+    <w:link w:val="10"/>
     <w:uiPriority w:val="9"/>
     <w:qFormat/>
     <w:rsid w:val="005D52E8"/>
@@ -2142,11 +2142,11 @@
       <w:szCs w:val="32"/>
     </w:rPr>
   </w:style>
-  <w:style w:type="paragraph" w:styleId="Heading2">
+  <w:style w:type="paragraph" w:styleId="2">
     <w:name w:val="heading 2"/>
-    <w:basedOn w:val="Normal"/>
-    <w:next w:val="Normal"/>
-    <w:link w:val="Heading2Char"/>
+    <w:basedOn w:val="a"/>
+    <w:next w:val="a"/>
+    <w:link w:val="20"/>
     <w:uiPriority w:val="9"/>
     <w:semiHidden/>
     <w:unhideWhenUsed/>
@@ -2167,11 +2167,11 @@
       <w:szCs w:val="28"/>
     </w:rPr>
   </w:style>
-  <w:style w:type="paragraph" w:styleId="Heading3">
+  <w:style w:type="paragraph" w:styleId="3">
     <w:name w:val="heading 3"/>
-    <w:basedOn w:val="Normal"/>
-    <w:next w:val="Normal"/>
-    <w:link w:val="Heading3Char"/>
+    <w:basedOn w:val="a"/>
+    <w:next w:val="a"/>
+    <w:link w:val="30"/>
     <w:uiPriority w:val="9"/>
     <w:semiHidden/>
     <w:unhideWhenUsed/>
@@ -2190,11 +2190,11 @@
       <w:szCs w:val="26"/>
     </w:rPr>
   </w:style>
-  <w:style w:type="paragraph" w:styleId="Heading4">
+  <w:style w:type="paragraph" w:styleId="4">
     <w:name w:val="heading 4"/>
-    <w:basedOn w:val="Normal"/>
-    <w:next w:val="Normal"/>
-    <w:link w:val="Heading4Char"/>
+    <w:basedOn w:val="a"/>
+    <w:next w:val="a"/>
+    <w:link w:val="40"/>
     <w:uiPriority w:val="9"/>
     <w:semiHidden/>
     <w:unhideWhenUsed/>
@@ -2212,11 +2212,11 @@
       <w:szCs w:val="28"/>
     </w:rPr>
   </w:style>
-  <w:style w:type="paragraph" w:styleId="Heading5">
+  <w:style w:type="paragraph" w:styleId="5">
     <w:name w:val="heading 5"/>
-    <w:basedOn w:val="Normal"/>
-    <w:next w:val="Normal"/>
-    <w:link w:val="Heading5Char"/>
+    <w:basedOn w:val="a"/>
+    <w:next w:val="a"/>
+    <w:link w:val="50"/>
     <w:uiPriority w:val="9"/>
     <w:semiHidden/>
     <w:unhideWhenUsed/>
@@ -2235,11 +2235,11 @@
       <w:szCs w:val="26"/>
     </w:rPr>
   </w:style>
-  <w:style w:type="paragraph" w:styleId="Heading6">
+  <w:style w:type="paragraph" w:styleId="6">
     <w:name w:val="heading 6"/>
-    <w:basedOn w:val="Normal"/>
-    <w:next w:val="Normal"/>
-    <w:link w:val="Heading6Char"/>
+    <w:basedOn w:val="a"/>
+    <w:next w:val="a"/>
+    <w:link w:val="60"/>
     <w:uiPriority w:val="9"/>
     <w:semiHidden/>
     <w:unhideWhenUsed/>
@@ -2256,11 +2256,11 @@
       <w:szCs w:val="22"/>
     </w:rPr>
   </w:style>
-  <w:style w:type="paragraph" w:styleId="Heading7">
+  <w:style w:type="paragraph" w:styleId="7">
     <w:name w:val="heading 7"/>
-    <w:basedOn w:val="Normal"/>
-    <w:next w:val="Normal"/>
-    <w:link w:val="Heading7Char"/>
+    <w:basedOn w:val="a"/>
+    <w:next w:val="a"/>
+    <w:link w:val="70"/>
     <w:uiPriority w:val="9"/>
     <w:semiHidden/>
     <w:unhideWhenUsed/>
@@ -2271,11 +2271,11 @@
       <w:outlineLvl w:val="6"/>
     </w:pPr>
   </w:style>
-  <w:style w:type="paragraph" w:styleId="Heading8">
+  <w:style w:type="paragraph" w:styleId="8">
     <w:name w:val="heading 8"/>
-    <w:basedOn w:val="Normal"/>
-    <w:next w:val="Normal"/>
-    <w:link w:val="Heading8Char"/>
+    <w:basedOn w:val="a"/>
+    <w:next w:val="a"/>
+    <w:link w:val="80"/>
     <w:uiPriority w:val="9"/>
     <w:semiHidden/>
     <w:unhideWhenUsed/>
@@ -2290,11 +2290,11 @@
       <w:iCs/>
     </w:rPr>
   </w:style>
-  <w:style w:type="paragraph" w:styleId="Heading9">
+  <w:style w:type="paragraph" w:styleId="9">
     <w:name w:val="heading 9"/>
-    <w:basedOn w:val="Normal"/>
-    <w:next w:val="Normal"/>
-    <w:link w:val="Heading9Char"/>
+    <w:basedOn w:val="a"/>
+    <w:next w:val="a"/>
+    <w:link w:val="90"/>
     <w:uiPriority w:val="9"/>
     <w:semiHidden/>
     <w:unhideWhenUsed/>
@@ -2310,13 +2310,13 @@
       <w:szCs w:val="22"/>
     </w:rPr>
   </w:style>
-  <w:style w:type="character" w:default="1" w:styleId="DefaultParagraphFont">
+  <w:style w:type="character" w:default="1" w:styleId="a0">
     <w:name w:val="Default Paragraph Font"/>
     <w:uiPriority w:val="1"/>
     <w:semiHidden/>
     <w:unhideWhenUsed/>
   </w:style>
-  <w:style w:type="table" w:default="1" w:styleId="TableNormal">
+  <w:style w:type="table" w:default="1" w:styleId="a1">
     <w:name w:val="Normal Table"/>
     <w:uiPriority w:val="99"/>
     <w:semiHidden/>
@@ -2331,15 +2331,15 @@
       </w:tblCellMar>
     </w:tblPr>
   </w:style>
-  <w:style w:type="numbering" w:default="1" w:styleId="NoList">
+  <w:style w:type="numbering" w:default="1" w:styleId="a2">
     <w:name w:val="No List"/>
     <w:uiPriority w:val="99"/>
     <w:semiHidden/>
     <w:unhideWhenUsed/>
   </w:style>
-  <w:style w:type="paragraph" w:styleId="NormalWeb">
+  <w:style w:type="paragraph" w:styleId="a3">
     <w:name w:val="Normal (Web)"/>
-    <w:basedOn w:val="Normal"/>
+    <w:basedOn w:val="a"/>
     <w:uiPriority w:val="99"/>
     <w:semiHidden/>
     <w:unhideWhenUsed/>
@@ -2354,13 +2354,13 @@
   </w:style>
   <w:style w:type="character" w:customStyle="1" w:styleId="apple-tab-span">
     <w:name w:val="apple-tab-span"/>
-    <w:basedOn w:val="DefaultParagraphFont"/>
+    <w:basedOn w:val="a0"/>
     <w:rsid w:val="000463DB"/>
   </w:style>
-  <w:style w:type="paragraph" w:styleId="BalloonText">
+  <w:style w:type="paragraph" w:styleId="a4">
     <w:name w:val="Balloon Text"/>
-    <w:basedOn w:val="Normal"/>
-    <w:link w:val="BalloonTextChar"/>
+    <w:basedOn w:val="a"/>
+    <w:link w:val="a5"/>
     <w:uiPriority w:val="99"/>
     <w:semiHidden/>
     <w:unhideWhenUsed/>
@@ -2371,10 +2371,10 @@
       <w:szCs w:val="22"/>
     </w:rPr>
   </w:style>
-  <w:style w:type="character" w:customStyle="1" w:styleId="BalloonTextChar">
-    <w:name w:val="Balloon Text Char"/>
-    <w:basedOn w:val="DefaultParagraphFont"/>
-    <w:link w:val="BalloonText"/>
+  <w:style w:type="character" w:customStyle="1" w:styleId="a5">
+    <w:name w:val="ข้อความบอลลูน อักขระ"/>
+    <w:basedOn w:val="a0"/>
+    <w:link w:val="a4"/>
     <w:uiPriority w:val="99"/>
     <w:semiHidden/>
     <w:rsid w:val="000C52FD"/>
@@ -2384,10 +2384,10 @@
       <w:szCs w:val="22"/>
     </w:rPr>
   </w:style>
-  <w:style w:type="paragraph" w:styleId="Header">
+  <w:style w:type="paragraph" w:styleId="a6">
     <w:name w:val="header"/>
-    <w:basedOn w:val="Normal"/>
-    <w:link w:val="HeaderChar"/>
+    <w:basedOn w:val="a"/>
+    <w:link w:val="a7"/>
     <w:uiPriority w:val="99"/>
     <w:unhideWhenUsed/>
     <w:rsid w:val="002E55A6"/>
@@ -2398,17 +2398,17 @@
       </w:tabs>
     </w:pPr>
   </w:style>
-  <w:style w:type="character" w:customStyle="1" w:styleId="HeaderChar">
-    <w:name w:val="Header Char"/>
-    <w:basedOn w:val="DefaultParagraphFont"/>
-    <w:link w:val="Header"/>
+  <w:style w:type="character" w:customStyle="1" w:styleId="a7">
+    <w:name w:val="หัวกระดาษ อักขระ"/>
+    <w:basedOn w:val="a0"/>
+    <w:link w:val="a6"/>
     <w:uiPriority w:val="99"/>
     <w:rsid w:val="002E55A6"/>
   </w:style>
-  <w:style w:type="paragraph" w:styleId="Footer">
+  <w:style w:type="paragraph" w:styleId="a8">
     <w:name w:val="footer"/>
-    <w:basedOn w:val="Normal"/>
-    <w:link w:val="FooterChar"/>
+    <w:basedOn w:val="a"/>
+    <w:link w:val="a9"/>
     <w:uiPriority w:val="99"/>
     <w:unhideWhenUsed/>
     <w:rsid w:val="002E55A6"/>
@@ -2419,17 +2419,17 @@
       </w:tabs>
     </w:pPr>
   </w:style>
-  <w:style w:type="character" w:customStyle="1" w:styleId="FooterChar">
-    <w:name w:val="Footer Char"/>
-    <w:basedOn w:val="DefaultParagraphFont"/>
-    <w:link w:val="Footer"/>
+  <w:style w:type="character" w:customStyle="1" w:styleId="a9">
+    <w:name w:val="ท้ายกระดาษ อักขระ"/>
+    <w:basedOn w:val="a0"/>
+    <w:link w:val="a8"/>
     <w:uiPriority w:val="99"/>
     <w:rsid w:val="002E55A6"/>
   </w:style>
-  <w:style w:type="character" w:customStyle="1" w:styleId="Heading1Char">
-    <w:name w:val="Heading 1 Char"/>
-    <w:basedOn w:val="DefaultParagraphFont"/>
-    <w:link w:val="Heading1"/>
+  <w:style w:type="character" w:customStyle="1" w:styleId="10">
+    <w:name w:val="หัวเรื่อง 1 อักขระ"/>
+    <w:basedOn w:val="a0"/>
+    <w:link w:val="1"/>
     <w:uiPriority w:val="9"/>
     <w:rsid w:val="005D52E8"/>
     <w:rPr>
@@ -2441,10 +2441,10 @@
       <w:szCs w:val="32"/>
     </w:rPr>
   </w:style>
-  <w:style w:type="character" w:customStyle="1" w:styleId="Heading2Char">
-    <w:name w:val="Heading 2 Char"/>
-    <w:basedOn w:val="DefaultParagraphFont"/>
-    <w:link w:val="Heading2"/>
+  <w:style w:type="character" w:customStyle="1" w:styleId="20">
+    <w:name w:val="หัวเรื่อง 2 อักขระ"/>
+    <w:basedOn w:val="a0"/>
+    <w:link w:val="2"/>
     <w:uiPriority w:val="9"/>
     <w:semiHidden/>
     <w:rsid w:val="005D52E8"/>
@@ -2458,10 +2458,10 @@
       <w:szCs w:val="28"/>
     </w:rPr>
   </w:style>
-  <w:style w:type="character" w:customStyle="1" w:styleId="Heading3Char">
-    <w:name w:val="Heading 3 Char"/>
-    <w:basedOn w:val="DefaultParagraphFont"/>
-    <w:link w:val="Heading3"/>
+  <w:style w:type="character" w:customStyle="1" w:styleId="30">
+    <w:name w:val="หัวเรื่อง 3 อักขระ"/>
+    <w:basedOn w:val="a0"/>
+    <w:link w:val="3"/>
     <w:uiPriority w:val="9"/>
     <w:semiHidden/>
     <w:rsid w:val="005D52E8"/>
@@ -2473,10 +2473,10 @@
       <w:szCs w:val="26"/>
     </w:rPr>
   </w:style>
-  <w:style w:type="character" w:customStyle="1" w:styleId="Heading4Char">
-    <w:name w:val="Heading 4 Char"/>
-    <w:basedOn w:val="DefaultParagraphFont"/>
-    <w:link w:val="Heading4"/>
+  <w:style w:type="character" w:customStyle="1" w:styleId="40">
+    <w:name w:val="หัวเรื่อง 4 อักขระ"/>
+    <w:basedOn w:val="a0"/>
+    <w:link w:val="4"/>
     <w:uiPriority w:val="9"/>
     <w:semiHidden/>
     <w:rsid w:val="005D52E8"/>
@@ -2487,10 +2487,10 @@
       <w:szCs w:val="28"/>
     </w:rPr>
   </w:style>
-  <w:style w:type="character" w:customStyle="1" w:styleId="Heading5Char">
-    <w:name w:val="Heading 5 Char"/>
-    <w:basedOn w:val="DefaultParagraphFont"/>
-    <w:link w:val="Heading5"/>
+  <w:style w:type="character" w:customStyle="1" w:styleId="50">
+    <w:name w:val="หัวเรื่อง 5 อักขระ"/>
+    <w:basedOn w:val="a0"/>
+    <w:link w:val="5"/>
     <w:uiPriority w:val="9"/>
     <w:semiHidden/>
     <w:rsid w:val="005D52E8"/>
@@ -2503,10 +2503,10 @@
       <w:szCs w:val="26"/>
     </w:rPr>
   </w:style>
-  <w:style w:type="character" w:customStyle="1" w:styleId="Heading6Char">
-    <w:name w:val="Heading 6 Char"/>
-    <w:basedOn w:val="DefaultParagraphFont"/>
-    <w:link w:val="Heading6"/>
+  <w:style w:type="character" w:customStyle="1" w:styleId="60">
+    <w:name w:val="หัวเรื่อง 6 อักขระ"/>
+    <w:basedOn w:val="a0"/>
+    <w:link w:val="6"/>
     <w:uiPriority w:val="9"/>
     <w:semiHidden/>
     <w:rsid w:val="005D52E8"/>
@@ -2515,10 +2515,10 @@
       <w:bCs/>
     </w:rPr>
   </w:style>
-  <w:style w:type="character" w:customStyle="1" w:styleId="Heading7Char">
-    <w:name w:val="Heading 7 Char"/>
-    <w:basedOn w:val="DefaultParagraphFont"/>
-    <w:link w:val="Heading7"/>
+  <w:style w:type="character" w:customStyle="1" w:styleId="70">
+    <w:name w:val="หัวเรื่อง 7 อักขระ"/>
+    <w:basedOn w:val="a0"/>
+    <w:link w:val="7"/>
     <w:uiPriority w:val="9"/>
     <w:semiHidden/>
     <w:rsid w:val="005D52E8"/>
@@ -2527,10 +2527,10 @@
       <w:szCs w:val="24"/>
     </w:rPr>
   </w:style>
-  <w:style w:type="character" w:customStyle="1" w:styleId="Heading8Char">
-    <w:name w:val="Heading 8 Char"/>
-    <w:basedOn w:val="DefaultParagraphFont"/>
-    <w:link w:val="Heading8"/>
+  <w:style w:type="character" w:customStyle="1" w:styleId="80">
+    <w:name w:val="หัวเรื่อง 8 อักขระ"/>
+    <w:basedOn w:val="a0"/>
+    <w:link w:val="8"/>
     <w:uiPriority w:val="9"/>
     <w:semiHidden/>
     <w:rsid w:val="005D52E8"/>
@@ -2541,10 +2541,10 @@
       <w:szCs w:val="24"/>
     </w:rPr>
   </w:style>
-  <w:style w:type="character" w:customStyle="1" w:styleId="Heading9Char">
-    <w:name w:val="Heading 9 Char"/>
-    <w:basedOn w:val="DefaultParagraphFont"/>
-    <w:link w:val="Heading9"/>
+  <w:style w:type="character" w:customStyle="1" w:styleId="90">
+    <w:name w:val="หัวเรื่อง 9 อักขระ"/>
+    <w:basedOn w:val="a0"/>
+    <w:link w:val="9"/>
     <w:uiPriority w:val="9"/>
     <w:semiHidden/>
     <w:rsid w:val="005D52E8"/>
@@ -2552,11 +2552,11 @@
       <w:rFonts w:asciiTheme="majorHAnsi" w:eastAsiaTheme="majorEastAsia" w:hAnsiTheme="majorHAnsi"/>
     </w:rPr>
   </w:style>
-  <w:style w:type="paragraph" w:styleId="Title">
+  <w:style w:type="paragraph" w:styleId="aa">
     <w:name w:val="Title"/>
-    <w:basedOn w:val="Normal"/>
-    <w:next w:val="Normal"/>
-    <w:link w:val="TitleChar"/>
+    <w:basedOn w:val="a"/>
+    <w:next w:val="a"/>
+    <w:link w:val="ab"/>
     <w:uiPriority w:val="10"/>
     <w:qFormat/>
     <w:rsid w:val="005D52E8"/>
@@ -2574,10 +2574,10 @@
       <w:szCs w:val="32"/>
     </w:rPr>
   </w:style>
-  <w:style w:type="character" w:customStyle="1" w:styleId="TitleChar">
-    <w:name w:val="Title Char"/>
-    <w:basedOn w:val="DefaultParagraphFont"/>
-    <w:link w:val="Title"/>
+  <w:style w:type="character" w:customStyle="1" w:styleId="ab">
+    <w:name w:val="ชื่อเรื่อง อักขระ"/>
+    <w:basedOn w:val="a0"/>
+    <w:link w:val="aa"/>
     <w:uiPriority w:val="10"/>
     <w:rsid w:val="005D52E8"/>
     <w:rPr>
@@ -2589,11 +2589,11 @@
       <w:szCs w:val="32"/>
     </w:rPr>
   </w:style>
-  <w:style w:type="paragraph" w:styleId="Subtitle">
+  <w:style w:type="paragraph" w:styleId="ac">
     <w:name w:val="Subtitle"/>
-    <w:basedOn w:val="Normal"/>
-    <w:next w:val="Normal"/>
-    <w:link w:val="SubtitleChar"/>
+    <w:basedOn w:val="a"/>
+    <w:next w:val="a"/>
+    <w:link w:val="ad"/>
     <w:uiPriority w:val="11"/>
     <w:qFormat/>
     <w:rsid w:val="005D52E8"/>
@@ -2606,10 +2606,10 @@
       <w:rFonts w:asciiTheme="majorHAnsi" w:eastAsiaTheme="majorEastAsia" w:hAnsiTheme="majorHAnsi"/>
     </w:rPr>
   </w:style>
-  <w:style w:type="character" w:customStyle="1" w:styleId="SubtitleChar">
-    <w:name w:val="Subtitle Char"/>
-    <w:basedOn w:val="DefaultParagraphFont"/>
-    <w:link w:val="Subtitle"/>
+  <w:style w:type="character" w:customStyle="1" w:styleId="ad">
+    <w:name w:val="ชื่อเรื่องรอง อักขระ"/>
+    <w:basedOn w:val="a0"/>
+    <w:link w:val="ac"/>
     <w:uiPriority w:val="11"/>
     <w:rsid w:val="005D52E8"/>
     <w:rPr>
@@ -2618,9 +2618,9 @@
       <w:szCs w:val="24"/>
     </w:rPr>
   </w:style>
-  <w:style w:type="character" w:styleId="Strong">
+  <w:style w:type="character" w:styleId="ae">
     <w:name w:val="Strong"/>
-    <w:basedOn w:val="DefaultParagraphFont"/>
+    <w:basedOn w:val="a0"/>
     <w:uiPriority w:val="22"/>
     <w:qFormat/>
     <w:rsid w:val="005D52E8"/>
@@ -2629,9 +2629,9 @@
       <w:bCs/>
     </w:rPr>
   </w:style>
-  <w:style w:type="character" w:styleId="Emphasis">
+  <w:style w:type="character" w:styleId="af">
     <w:name w:val="Emphasis"/>
-    <w:basedOn w:val="DefaultParagraphFont"/>
+    <w:basedOn w:val="a0"/>
     <w:uiPriority w:val="20"/>
     <w:qFormat/>
     <w:rsid w:val="005D52E8"/>
@@ -2642,9 +2642,9 @@
       <w:iCs/>
     </w:rPr>
   </w:style>
-  <w:style w:type="paragraph" w:styleId="NoSpacing">
+  <w:style w:type="paragraph" w:styleId="af0">
     <w:name w:val="No Spacing"/>
-    <w:basedOn w:val="Normal"/>
+    <w:basedOn w:val="a"/>
     <w:uiPriority w:val="1"/>
     <w:qFormat/>
     <w:rsid w:val="005D52E8"/>
@@ -2652,9 +2652,9 @@
       <w:szCs w:val="32"/>
     </w:rPr>
   </w:style>
-  <w:style w:type="paragraph" w:styleId="ListParagraph">
+  <w:style w:type="paragraph" w:styleId="af1">
     <w:name w:val="List Paragraph"/>
-    <w:basedOn w:val="Normal"/>
+    <w:basedOn w:val="a"/>
     <w:uiPriority w:val="34"/>
     <w:qFormat/>
     <w:rsid w:val="005D52E8"/>
@@ -2663,11 +2663,11 @@
       <w:contextualSpacing/>
     </w:pPr>
   </w:style>
-  <w:style w:type="paragraph" w:styleId="Quote">
+  <w:style w:type="paragraph" w:styleId="af2">
     <w:name w:val="Quote"/>
-    <w:basedOn w:val="Normal"/>
-    <w:next w:val="Normal"/>
-    <w:link w:val="QuoteChar"/>
+    <w:basedOn w:val="a"/>
+    <w:next w:val="a"/>
+    <w:link w:val="af3"/>
     <w:uiPriority w:val="29"/>
     <w:qFormat/>
     <w:rsid w:val="005D52E8"/>
@@ -2675,10 +2675,10 @@
       <w:i/>
     </w:rPr>
   </w:style>
-  <w:style w:type="character" w:customStyle="1" w:styleId="QuoteChar">
-    <w:name w:val="Quote Char"/>
-    <w:basedOn w:val="DefaultParagraphFont"/>
-    <w:link w:val="Quote"/>
+  <w:style w:type="character" w:customStyle="1" w:styleId="af3">
+    <w:name w:val="คำอ้างอิง อักขระ"/>
+    <w:basedOn w:val="a0"/>
+    <w:link w:val="af2"/>
     <w:uiPriority w:val="29"/>
     <w:rsid w:val="005D52E8"/>
     <w:rPr>
@@ -2687,11 +2687,11 @@
       <w:szCs w:val="24"/>
     </w:rPr>
   </w:style>
-  <w:style w:type="paragraph" w:styleId="IntenseQuote">
+  <w:style w:type="paragraph" w:styleId="af4">
     <w:name w:val="Intense Quote"/>
-    <w:basedOn w:val="Normal"/>
-    <w:next w:val="Normal"/>
-    <w:link w:val="IntenseQuoteChar"/>
+    <w:basedOn w:val="a"/>
+    <w:next w:val="a"/>
+    <w:link w:val="af5"/>
     <w:uiPriority w:val="30"/>
     <w:qFormat/>
     <w:rsid w:val="005D52E8"/>
@@ -2704,10 +2704,10 @@
       <w:szCs w:val="22"/>
     </w:rPr>
   </w:style>
-  <w:style w:type="character" w:customStyle="1" w:styleId="IntenseQuoteChar">
-    <w:name w:val="Intense Quote Char"/>
-    <w:basedOn w:val="DefaultParagraphFont"/>
-    <w:link w:val="IntenseQuote"/>
+  <w:style w:type="character" w:customStyle="1" w:styleId="af5">
+    <w:name w:val="ทำให้คำอ้างอิงเป็นสีเข้มขึ้น อักขระ"/>
+    <w:basedOn w:val="a0"/>
+    <w:link w:val="af4"/>
     <w:uiPriority w:val="30"/>
     <w:rsid w:val="005D52E8"/>
     <w:rPr>
@@ -2716,7 +2716,7 @@
       <w:sz w:val="24"/>
     </w:rPr>
   </w:style>
-  <w:style w:type="character" w:styleId="SubtleEmphasis">
+  <w:style w:type="character" w:styleId="af6">
     <w:name w:val="Subtle Emphasis"/>
     <w:uiPriority w:val="19"/>
     <w:qFormat/>
@@ -2726,9 +2726,9 @@
       <w:color w:val="5A5A5A" w:themeColor="text1" w:themeTint="A5"/>
     </w:rPr>
   </w:style>
-  <w:style w:type="character" w:styleId="IntenseEmphasis">
+  <w:style w:type="character" w:styleId="af7">
     <w:name w:val="Intense Emphasis"/>
-    <w:basedOn w:val="DefaultParagraphFont"/>
+    <w:basedOn w:val="a0"/>
     <w:uiPriority w:val="21"/>
     <w:qFormat/>
     <w:rsid w:val="005D52E8"/>
@@ -2740,9 +2740,9 @@
       <w:u w:val="single"/>
     </w:rPr>
   </w:style>
-  <w:style w:type="character" w:styleId="SubtleReference">
+  <w:style w:type="character" w:styleId="af8">
     <w:name w:val="Subtle Reference"/>
-    <w:basedOn w:val="DefaultParagraphFont"/>
+    <w:basedOn w:val="a0"/>
     <w:uiPriority w:val="31"/>
     <w:qFormat/>
     <w:rsid w:val="005D52E8"/>
@@ -2752,9 +2752,9 @@
       <w:u w:val="single"/>
     </w:rPr>
   </w:style>
-  <w:style w:type="character" w:styleId="IntenseReference">
+  <w:style w:type="character" w:styleId="af9">
     <w:name w:val="Intense Reference"/>
-    <w:basedOn w:val="DefaultParagraphFont"/>
+    <w:basedOn w:val="a0"/>
     <w:uiPriority w:val="32"/>
     <w:qFormat/>
     <w:rsid w:val="005D52E8"/>
@@ -2764,9 +2764,9 @@
       <w:u w:val="single"/>
     </w:rPr>
   </w:style>
-  <w:style w:type="character" w:styleId="BookTitle">
+  <w:style w:type="character" w:styleId="afa">
     <w:name w:val="Book Title"/>
-    <w:basedOn w:val="DefaultParagraphFont"/>
+    <w:basedOn w:val="a0"/>
     <w:uiPriority w:val="33"/>
     <w:qFormat/>
     <w:rsid w:val="005D52E8"/>
@@ -2778,10 +2778,10 @@
       <w:szCs w:val="24"/>
     </w:rPr>
   </w:style>
-  <w:style w:type="paragraph" w:styleId="TOCHeading">
+  <w:style w:type="paragraph" w:styleId="afb">
     <w:name w:val="TOC Heading"/>
-    <w:basedOn w:val="Heading1"/>
-    <w:next w:val="Normal"/>
+    <w:basedOn w:val="1"/>
+    <w:next w:val="a"/>
     <w:uiPriority w:val="39"/>
     <w:semiHidden/>
     <w:unhideWhenUsed/>
@@ -2791,9 +2791,9 @@
       <w:outlineLvl w:val="9"/>
     </w:pPr>
   </w:style>
-  <w:style w:type="table" w:styleId="TableGrid">
+  <w:style w:type="table" w:styleId="afc">
     <w:name w:val="Table Grid"/>
-    <w:basedOn w:val="TableNormal"/>
+    <w:basedOn w:val="a1"/>
     <w:uiPriority w:val="39"/>
     <w:rsid w:val="005E088A"/>
     <w:tblPr>

</xml_diff>

<commit_message>
KKU docs sync and user storage retirement
This change retires the applicant personal file locker, keeps admin storage unlimited, and adds slot-based attachment validation for academic document 1. It also syncs KKU HR regulations/announcements into the documents library with category grouping and a manual admin sync action, while updating the PDF viewer, language-switch loading state, and related UI and tests.
</commit_message>
<xml_diff>
--- a/HRCP-KKU-Academic/src/main/resources/templates/docx/doc_0.docx
+++ b/HRCP-KKU-Academic/src/main/resources/templates/docx/doc_0.docx
@@ -1,6 +1,6 @@
 
 <file path=word/document.xml><?xml version="1.0" encoding="utf-8"?>
-<w:document xmlns:wpc="http://schemas.microsoft.com/office/word/2010/wordprocessingCanvas" xmlns:cx="http://schemas.microsoft.com/office/drawing/2014/chartex" xmlns:cx1="http://schemas.microsoft.com/office/drawing/2015/9/8/chartex" xmlns:cx2="http://schemas.microsoft.com/office/drawing/2015/10/21/chartex" xmlns:cx3="http://schemas.microsoft.com/office/drawing/2016/5/9/chartex" xmlns:cx4="http://schemas.microsoft.com/office/drawing/2016/5/10/chartex" xmlns:cx5="http://schemas.microsoft.com/office/drawing/2016/5/11/chartex" xmlns:cx6="http://schemas.microsoft.com/office/drawing/2016/5/12/chartex" xmlns:cx7="http://schemas.microsoft.com/office/drawing/2016/5/13/chartex" xmlns:cx8="http://schemas.microsoft.com/office/drawing/2016/5/14/chartex" xmlns:mc="http://schemas.openxmlformats.org/markup-compatibility/2006" xmlns:aink="http://schemas.microsoft.com/office/drawing/2016/ink" xmlns:am3d="http://schemas.microsoft.com/office/drawing/2017/model3d" xmlns:o="urn:schemas-microsoft-com:office:office" xmlns:oel="http://schemas.microsoft.com/office/2019/extlst" xmlns:r="http://schemas.openxmlformats.org/officeDocument/2006/relationships" xmlns:m="http://schemas.openxmlformats.org/officeDocument/2006/math" xmlns:v="urn:schemas-microsoft-com:vml" xmlns:wp14="http://schemas.microsoft.com/office/word/2010/wordprocessingDrawing" xmlns:wp="http://schemas.openxmlformats.org/drawingml/2006/wordprocessingDrawing" xmlns:w10="urn:schemas-microsoft-com:office:word" xmlns:w="http://schemas.openxmlformats.org/wordprocessingml/2006/main" xmlns:w14="http://schemas.microsoft.com/office/word/2010/wordml" xmlns:w15="http://schemas.microsoft.com/office/word/2012/wordml" xmlns:w16cex="http://schemas.microsoft.com/office/word/2018/wordml/cex" xmlns:w16cid="http://schemas.microsoft.com/office/word/2016/wordml/cid" xmlns:w16="http://schemas.microsoft.com/office/word/2018/wordml" xmlns:w16du="http://schemas.microsoft.com/office/word/2023/wordml/word16du" xmlns:w16sdtdh="http://schemas.microsoft.com/office/word/2020/wordml/sdtdatahash" xmlns:w16sdtfl="http://schemas.microsoft.com/office/word/2024/wordml/sdtformatlock" xmlns:w16se="http://schemas.microsoft.com/office/word/2015/wordml/symex" xmlns:wpg="http://schemas.microsoft.com/office/word/2010/wordprocessingGroup" xmlns:wpi="http://schemas.microsoft.com/office/word/2010/wordprocessingInk" xmlns:wne="http://schemas.microsoft.com/office/word/2006/wordml" xmlns:wps="http://schemas.microsoft.com/office/word/2010/wordprocessingShape" mc:Ignorable="w14 w15 w16se w16cid w16 w16cex w16sdtdh w16sdtfl w16du wp14">
+<w:document xmlns:wpc="http://schemas.microsoft.com/office/word/2010/wordprocessingCanvas" xmlns:cx="http://schemas.microsoft.com/office/drawing/2014/chartex" xmlns:cx1="http://schemas.microsoft.com/office/drawing/2015/9/8/chartex" xmlns:cx2="http://schemas.microsoft.com/office/drawing/2015/10/21/chartex" xmlns:cx3="http://schemas.microsoft.com/office/drawing/2016/5/9/chartex" xmlns:cx4="http://schemas.microsoft.com/office/drawing/2016/5/10/chartex" xmlns:cx5="http://schemas.microsoft.com/office/drawing/2016/5/11/chartex" xmlns:cx6="http://schemas.microsoft.com/office/drawing/2016/5/12/chartex" xmlns:cx7="http://schemas.microsoft.com/office/drawing/2016/5/13/chartex" xmlns:cx8="http://schemas.microsoft.com/office/drawing/2016/5/14/chartex" xmlns:mc="http://schemas.openxmlformats.org/markup-compatibility/2006" xmlns:m="http://schemas.openxmlformats.org/officeDocument/2006/math" xmlns:aink="http://schemas.microsoft.com/office/drawing/2016/ink" xmlns:am3d="http://schemas.microsoft.com/office/drawing/2017/model3d" xmlns:oel="http://schemas.microsoft.com/office/2019/extlst" xmlns:r="http://schemas.openxmlformats.org/officeDocument/2006/relationships" xmlns:wp14="http://schemas.microsoft.com/office/word/2010/wordprocessingDrawing" xmlns:wp="http://schemas.openxmlformats.org/drawingml/2006/wordprocessingDrawing" xmlns:wpg="http://schemas.microsoft.com/office/word/2010/wordprocessingGroup" xmlns:wpi="http://schemas.microsoft.com/office/word/2010/wordprocessingInk" xmlns:wps="http://schemas.microsoft.com/office/word/2010/wordprocessingShape" xmlns:o="urn:schemas-microsoft-com:office:office" xmlns:v="urn:schemas-microsoft-com:vml" xmlns:w10="urn:schemas-microsoft-com:office:word" xmlns:w="http://schemas.openxmlformats.org/wordprocessingml/2006/main" xmlns:w14="http://schemas.microsoft.com/office/word/2010/wordml" xmlns:w15="http://schemas.microsoft.com/office/word/2012/wordml" xmlns:w16cex="http://schemas.microsoft.com/office/word/2018/wordml/cex" xmlns:w16cid="http://schemas.microsoft.com/office/word/2016/wordml/cid" xmlns:w16="http://schemas.microsoft.com/office/word/2018/wordml" xmlns:w16sdtdh="http://schemas.microsoft.com/office/word/2020/wordml/sdtdatahash" xmlns:w16sdtfl="http://schemas.microsoft.com/office/word/2024/wordml/sdtformatlock" xmlns:w16se="http://schemas.microsoft.com/office/word/2015/wordml/symex" xmlns:w16du="http://schemas.microsoft.com/office/word/2023/wordml/word16du" xmlns:wne="http://schemas.microsoft.com/office/word/2006/wordml" mc:Ignorable="w14 w15 w16se w16cid w16 w16cex w16sdtdh w16sdtfl w16du wp14">
   <w:body>
     <w:p>
       <w:pPr>
@@ -28,7 +28,7 @@
           <w:lang w:val="en-US"/>
         </w:rPr>
         <w:drawing>
-          <wp:anchor distT="0" distB="0" distL="114300" distR="114300" simplePos="0" relativeHeight="251659264" behindDoc="0" locked="1" layoutInCell="1" allowOverlap="1" wp14:anchorId="68A6F703" wp14:editId="7992DAA0">
+          <wp:anchor distT="0" distB="0" distL="114300" distR="114300" simplePos="0" relativeHeight="251659264" behindDoc="0" locked="1" layoutInCell="1" allowOverlap="1" wp14:anchorId="68A6F703" wp14:editId="675661B3">
             <wp:simplePos x="0" y="0"/>
             <wp:positionH relativeFrom="margin">
               <wp:posOffset>0</wp:posOffset>
@@ -313,6 +313,7 @@
         </w:rPr>
         <w:t>{{</w:t>
       </w:r>
+      <w:proofErr w:type="spellStart"/>
       <w:r>
         <w:rPr>
           <w:rFonts w:ascii="TH Sarabun New" w:eastAsia="Times New Roman" w:hAnsi="TH Sarabun New" w:cs="TH Sarabun New"/>
@@ -323,6 +324,7 @@
         </w:rPr>
         <w:t>memo_no</w:t>
       </w:r>
+      <w:proofErr w:type="spellEnd"/>
       <w:r>
         <w:rPr>
           <w:rFonts w:ascii="TH Sarabun New" w:eastAsia="Times New Roman" w:hAnsi="TH Sarabun New" w:cs="TH Sarabun New"/>
@@ -609,6 +611,7 @@
         </w:rPr>
         <w:t>}}{{</w:t>
       </w:r>
+      <w:proofErr w:type="spellStart"/>
       <w:r>
         <w:rPr>
           <w:rFonts w:ascii="TH Sarabun New" w:eastAsia="Times New Roman" w:hAnsi="TH Sarabun New" w:cs="TH Sarabun New"/>
@@ -619,6 +622,7 @@
         </w:rPr>
         <w:t>applicant_name</w:t>
       </w:r>
+      <w:proofErr w:type="spellEnd"/>
       <w:r>
         <w:rPr>
           <w:rFonts w:ascii="TH Sarabun New" w:eastAsia="Times New Roman" w:hAnsi="TH Sarabun New" w:cs="TH Sarabun New"/>
@@ -648,7 +652,18 @@
           <w:szCs w:val="32"/>
           <w:lang w:eastAsia="en-GB"/>
         </w:rPr>
-        <w:t>{{employ</w:t>
+        <w:t>{{</w:t>
+      </w:r>
+      <w:proofErr w:type="spellStart"/>
+      <w:r>
+        <w:rPr>
+          <w:rFonts w:ascii="TH Sarabun New" w:eastAsia="Times New Roman" w:hAnsi="TH Sarabun New" w:cs="TH Sarabun New"/>
+          <w:color w:val="000000" w:themeColor="text1"/>
+          <w:sz w:val="32"/>
+          <w:szCs w:val="32"/>
+          <w:lang w:eastAsia="en-GB"/>
+        </w:rPr>
+        <w:t>employ</w:t>
       </w:r>
       <w:r>
         <w:rPr>
@@ -668,7 +683,18 @@
           <w:szCs w:val="32"/>
           <w:lang w:eastAsia="en-GB"/>
         </w:rPr>
-        <w:t>_type}}</w:t>
+        <w:t>_type</w:t>
+      </w:r>
+      <w:proofErr w:type="spellEnd"/>
+      <w:r>
+        <w:rPr>
+          <w:rFonts w:ascii="TH Sarabun New" w:eastAsia="Times New Roman" w:hAnsi="TH Sarabun New" w:cs="TH Sarabun New"/>
+          <w:color w:val="000000" w:themeColor="text1"/>
+          <w:sz w:val="32"/>
+          <w:szCs w:val="32"/>
+          <w:lang w:eastAsia="en-GB"/>
+        </w:rPr>
+        <w:t>}}</w:t>
       </w:r>
       <w:r>
         <w:rPr>
@@ -699,7 +725,18 @@
           <w:szCs w:val="32"/>
           <w:lang w:eastAsia="en-GB"/>
         </w:rPr>
-        <w:t>{{current_</w:t>
+        <w:t>{{</w:t>
+      </w:r>
+      <w:proofErr w:type="spellStart"/>
+      <w:r>
+        <w:rPr>
+          <w:rFonts w:ascii="TH Sarabun New" w:eastAsia="Times New Roman" w:hAnsi="TH Sarabun New" w:cs="TH Sarabun New"/>
+          <w:color w:val="000000" w:themeColor="text1"/>
+          <w:sz w:val="32"/>
+          <w:szCs w:val="32"/>
+          <w:lang w:eastAsia="en-GB"/>
+        </w:rPr>
+        <w:t>current_</w:t>
       </w:r>
       <w:r>
         <w:rPr>
@@ -711,6 +748,7 @@
         </w:rPr>
         <w:t>position</w:t>
       </w:r>
+      <w:proofErr w:type="spellEnd"/>
       <w:r>
         <w:rPr>
           <w:rFonts w:ascii="TH Sarabun New" w:eastAsia="Times New Roman" w:hAnsi="TH Sarabun New" w:cs="TH Sarabun New"/>
@@ -802,38 +840,7 @@
           <w:cs/>
           <w:lang w:val="en-US" w:eastAsia="en-GB"/>
         </w:rPr>
-        <w:t xml:space="preserve">รองศาสตราจารย์ </w:t>
-      </w:r>
-      <w:r>
-        <w:rPr>
-          <w:rFonts w:ascii="TH Sarabun New" w:eastAsia="Times New Roman" w:hAnsi="TH Sarabun New" w:cs="TH Sarabun New"/>
-          <w:color w:val="000000" w:themeColor="text1"/>
-          <w:sz w:val="32"/>
-          <w:szCs w:val="32"/>
-          <w:lang w:val="en-US" w:eastAsia="en-GB"/>
-        </w:rPr>
-        <w:t>[{{chk3}}]</w:t>
-      </w:r>
-      <w:r>
-        <w:rPr>
-          <w:rFonts w:ascii="TH Sarabun New" w:eastAsia="Times New Roman" w:hAnsi="TH Sarabun New" w:cs="TH Sarabun New"/>
-          <w:color w:val="000000" w:themeColor="text1"/>
-          <w:sz w:val="32"/>
-          <w:szCs w:val="32"/>
-          <w:lang w:val="en-US" w:eastAsia="en-GB"/>
-        </w:rPr>
-        <w:t xml:space="preserve"> </w:t>
-      </w:r>
-      <w:r>
-        <w:rPr>
-          <w:rFonts w:ascii="TH Sarabun New" w:eastAsia="Times New Roman" w:hAnsi="TH Sarabun New" w:cs="TH Sarabun New" w:hint="cs"/>
-          <w:color w:val="000000" w:themeColor="text1"/>
-          <w:sz w:val="32"/>
-          <w:szCs w:val="32"/>
-          <w:cs/>
-          <w:lang w:val="en-US" w:eastAsia="en-GB"/>
-        </w:rPr>
-        <w:t>ศาสตราจารย์ พร้อมนี้ได้แนบเอกสารประกอบการขอประเมินผลการสอน จำนวน  3 ชุด ดังนี้</w:t>
+        <w:t>รองศาสตราจารย์ พร้อมนี้ได้แนบเอกสารประกอบการขอประเมินผลการสอน จำนวน  3 ชุด ดังนี้</w:t>
       </w:r>
     </w:p>
     <w:p>
@@ -901,6 +908,7 @@
         </w:rPr>
         <w:t xml:space="preserve"> {{</w:t>
       </w:r>
+      <w:proofErr w:type="spellStart"/>
       <w:r>
         <w:rPr>
           <w:rFonts w:ascii="TH Sarabun New" w:hAnsi="TH Sarabun New" w:cs="TH Sarabun New"/>
@@ -911,6 +919,7 @@
         </w:rPr>
         <w:t>course_name</w:t>
       </w:r>
+      <w:proofErr w:type="spellEnd"/>
       <w:r>
         <w:rPr>
           <w:rFonts w:ascii="TH Sarabun New" w:eastAsia="Times New Roman" w:hAnsi="TH Sarabun New" w:cs="TH Sarabun New"/>
@@ -942,6 +951,7 @@
         </w:rPr>
         <w:t xml:space="preserve"> {{</w:t>
       </w:r>
+      <w:proofErr w:type="spellStart"/>
       <w:r>
         <w:rPr>
           <w:rFonts w:ascii="TH Sarabun New" w:hAnsi="TH Sarabun New" w:cs="TH Sarabun New"/>
@@ -952,6 +962,7 @@
         </w:rPr>
         <w:t>course_code</w:t>
       </w:r>
+      <w:proofErr w:type="spellEnd"/>
       <w:r>
         <w:rPr>
           <w:rFonts w:ascii="TH Sarabun New" w:eastAsia="Times New Roman" w:hAnsi="TH Sarabun New" w:cs="TH Sarabun New"/>
@@ -983,6 +994,7 @@
         </w:rPr>
         <w:t xml:space="preserve"> {{</w:t>
       </w:r>
+      <w:proofErr w:type="spellStart"/>
       <w:r>
         <w:rPr>
           <w:rFonts w:ascii="TH Sarabun New" w:eastAsia="Times New Roman" w:hAnsi="TH Sarabun New" w:cs="TH Sarabun New"/>
@@ -993,6 +1005,7 @@
         </w:rPr>
         <w:t>academic_year</w:t>
       </w:r>
+      <w:proofErr w:type="spellEnd"/>
       <w:r>
         <w:rPr>
           <w:rFonts w:ascii="TH Sarabun New" w:eastAsia="Times New Roman" w:hAnsi="TH Sarabun New" w:cs="TH Sarabun New"/>
@@ -1069,6 +1082,7 @@
         </w:rPr>
         <w:t xml:space="preserve"> {{</w:t>
       </w:r>
+      <w:proofErr w:type="spellStart"/>
       <w:r>
         <w:rPr>
           <w:rFonts w:ascii="TH Sarabun New" w:hAnsi="TH Sarabun New" w:cs="TH Sarabun New"/>
@@ -1079,6 +1093,7 @@
         </w:rPr>
         <w:t>course_name</w:t>
       </w:r>
+      <w:proofErr w:type="spellEnd"/>
       <w:r>
         <w:rPr>
           <w:rFonts w:ascii="TH Sarabun New" w:eastAsia="Times New Roman" w:hAnsi="TH Sarabun New" w:cs="TH Sarabun New"/>
@@ -1110,6 +1125,7 @@
         </w:rPr>
         <w:t>{{</w:t>
       </w:r>
+      <w:proofErr w:type="spellStart"/>
       <w:r>
         <w:rPr>
           <w:rFonts w:ascii="TH Sarabun New" w:hAnsi="TH Sarabun New" w:cs="TH Sarabun New"/>
@@ -1120,6 +1136,7 @@
         </w:rPr>
         <w:t>course_code</w:t>
       </w:r>
+      <w:proofErr w:type="spellEnd"/>
       <w:r>
         <w:rPr>
           <w:rFonts w:ascii="TH Sarabun New" w:eastAsia="Times New Roman" w:hAnsi="TH Sarabun New" w:cs="TH Sarabun New"/>
@@ -1151,6 +1168,7 @@
         </w:rPr>
         <w:t xml:space="preserve"> {{</w:t>
       </w:r>
+      <w:proofErr w:type="spellStart"/>
       <w:r>
         <w:rPr>
           <w:rFonts w:ascii="TH Sarabun New" w:eastAsia="Times New Roman" w:hAnsi="TH Sarabun New" w:cs="TH Sarabun New"/>
@@ -1161,6 +1179,7 @@
         </w:rPr>
         <w:t>academic_year</w:t>
       </w:r>
+      <w:proofErr w:type="spellEnd"/>
       <w:r>
         <w:rPr>
           <w:rFonts w:ascii="TH Sarabun New" w:eastAsia="Times New Roman" w:hAnsi="TH Sarabun New" w:cs="TH Sarabun New"/>
@@ -1258,6 +1277,7 @@
         </w:rPr>
         <w:t xml:space="preserve"> {{</w:t>
       </w:r>
+      <w:proofErr w:type="spellStart"/>
       <w:r>
         <w:rPr>
           <w:rFonts w:ascii="TH Sarabun New" w:hAnsi="TH Sarabun New" w:cs="TH Sarabun New"/>
@@ -1268,6 +1288,7 @@
         </w:rPr>
         <w:t>course_name</w:t>
       </w:r>
+      <w:proofErr w:type="spellEnd"/>
       <w:r>
         <w:rPr>
           <w:rFonts w:ascii="TH Sarabun New" w:eastAsia="Times New Roman" w:hAnsi="TH Sarabun New" w:cs="TH Sarabun New"/>
@@ -1299,6 +1320,7 @@
         </w:rPr>
         <w:t xml:space="preserve"> {{</w:t>
       </w:r>
+      <w:proofErr w:type="spellStart"/>
       <w:r>
         <w:rPr>
           <w:rFonts w:ascii="TH Sarabun New" w:hAnsi="TH Sarabun New" w:cs="TH Sarabun New"/>
@@ -1309,6 +1331,7 @@
         </w:rPr>
         <w:t>course_code</w:t>
       </w:r>
+      <w:proofErr w:type="spellEnd"/>
       <w:r>
         <w:rPr>
           <w:rFonts w:ascii="TH Sarabun New" w:eastAsia="Times New Roman" w:hAnsi="TH Sarabun New" w:cs="TH Sarabun New"/>
@@ -1340,6 +1363,7 @@
         </w:rPr>
         <w:t xml:space="preserve"> {{</w:t>
       </w:r>
+      <w:proofErr w:type="spellStart"/>
       <w:r>
         <w:rPr>
           <w:rFonts w:ascii="TH Sarabun New" w:eastAsia="Times New Roman" w:hAnsi="TH Sarabun New" w:cs="TH Sarabun New"/>
@@ -1350,6 +1374,7 @@
         </w:rPr>
         <w:t>academic_year</w:t>
       </w:r>
+      <w:proofErr w:type="spellEnd"/>
       <w:r>
         <w:rPr>
           <w:rFonts w:ascii="TH Sarabun New" w:eastAsia="Times New Roman" w:hAnsi="TH Sarabun New" w:cs="TH Sarabun New"/>
@@ -1582,7 +1607,29 @@
           <w:szCs w:val="32"/>
           <w:lang w:eastAsia="en-GB"/>
         </w:rPr>
-        <w:t>{{applicant_name}}</w:t>
+        <w:t>{{</w:t>
+      </w:r>
+      <w:proofErr w:type="spellStart"/>
+      <w:r>
+        <w:rPr>
+          <w:rFonts w:ascii="TH Sarabun New" w:eastAsia="Times New Roman" w:hAnsi="TH Sarabun New" w:cs="TH Sarabun New"/>
+          <w:color w:val="000000" w:themeColor="text1"/>
+          <w:sz w:val="32"/>
+          <w:szCs w:val="32"/>
+          <w:lang w:eastAsia="en-GB"/>
+        </w:rPr>
+        <w:t>applicant_name</w:t>
+      </w:r>
+      <w:proofErr w:type="spellEnd"/>
+      <w:r>
+        <w:rPr>
+          <w:rFonts w:ascii="TH Sarabun New" w:eastAsia="Times New Roman" w:hAnsi="TH Sarabun New" w:cs="TH Sarabun New"/>
+          <w:color w:val="000000" w:themeColor="text1"/>
+          <w:sz w:val="32"/>
+          <w:szCs w:val="32"/>
+          <w:lang w:eastAsia="en-GB"/>
+        </w:rPr>
+        <w:t>}}</w:t>
       </w:r>
       <w:r>
         <w:rPr>
@@ -1683,7 +1730,7 @@
 </file>
 
 <file path=word/endnotes.xml><?xml version="1.0" encoding="utf-8"?>
-<w:endnotes xmlns:wpc="http://schemas.microsoft.com/office/word/2010/wordprocessingCanvas" xmlns:cx="http://schemas.microsoft.com/office/drawing/2014/chartex" xmlns:cx1="http://schemas.microsoft.com/office/drawing/2015/9/8/chartex" xmlns:cx2="http://schemas.microsoft.com/office/drawing/2015/10/21/chartex" xmlns:cx3="http://schemas.microsoft.com/office/drawing/2016/5/9/chartex" xmlns:cx4="http://schemas.microsoft.com/office/drawing/2016/5/10/chartex" xmlns:cx5="http://schemas.microsoft.com/office/drawing/2016/5/11/chartex" xmlns:cx6="http://schemas.microsoft.com/office/drawing/2016/5/12/chartex" xmlns:cx7="http://schemas.microsoft.com/office/drawing/2016/5/13/chartex" xmlns:cx8="http://schemas.microsoft.com/office/drawing/2016/5/14/chartex" xmlns:mc="http://schemas.openxmlformats.org/markup-compatibility/2006" xmlns:aink="http://schemas.microsoft.com/office/drawing/2016/ink" xmlns:am3d="http://schemas.microsoft.com/office/drawing/2017/model3d" xmlns:o="urn:schemas-microsoft-com:office:office" xmlns:oel="http://schemas.microsoft.com/office/2019/extlst" xmlns:r="http://schemas.openxmlformats.org/officeDocument/2006/relationships" xmlns:m="http://schemas.openxmlformats.org/officeDocument/2006/math" xmlns:v="urn:schemas-microsoft-com:vml" xmlns:wp14="http://schemas.microsoft.com/office/word/2010/wordprocessingDrawing" xmlns:wp="http://schemas.openxmlformats.org/drawingml/2006/wordprocessingDrawing" xmlns:w10="urn:schemas-microsoft-com:office:word" xmlns:w="http://schemas.openxmlformats.org/wordprocessingml/2006/main" xmlns:w14="http://schemas.microsoft.com/office/word/2010/wordml" xmlns:w15="http://schemas.microsoft.com/office/word/2012/wordml" xmlns:w16cex="http://schemas.microsoft.com/office/word/2018/wordml/cex" xmlns:w16cid="http://schemas.microsoft.com/office/word/2016/wordml/cid" xmlns:w16="http://schemas.microsoft.com/office/word/2018/wordml" xmlns:w16du="http://schemas.microsoft.com/office/word/2023/wordml/word16du" xmlns:w16sdtdh="http://schemas.microsoft.com/office/word/2020/wordml/sdtdatahash" xmlns:w16sdtfl="http://schemas.microsoft.com/office/word/2024/wordml/sdtformatlock" xmlns:w16se="http://schemas.microsoft.com/office/word/2015/wordml/symex" xmlns:wpg="http://schemas.microsoft.com/office/word/2010/wordprocessingGroup" xmlns:wpi="http://schemas.microsoft.com/office/word/2010/wordprocessingInk" xmlns:wne="http://schemas.microsoft.com/office/word/2006/wordml" xmlns:wps="http://schemas.microsoft.com/office/word/2010/wordprocessingShape" mc:Ignorable="w14 w15 w16se w16cid w16 w16cex w16sdtdh w16sdtfl w16du wp14">
+<w:endnotes xmlns:wpc="http://schemas.microsoft.com/office/word/2010/wordprocessingCanvas" xmlns:cx="http://schemas.microsoft.com/office/drawing/2014/chartex" xmlns:cx1="http://schemas.microsoft.com/office/drawing/2015/9/8/chartex" xmlns:cx2="http://schemas.microsoft.com/office/drawing/2015/10/21/chartex" xmlns:cx3="http://schemas.microsoft.com/office/drawing/2016/5/9/chartex" xmlns:cx4="http://schemas.microsoft.com/office/drawing/2016/5/10/chartex" xmlns:cx5="http://schemas.microsoft.com/office/drawing/2016/5/11/chartex" xmlns:cx6="http://schemas.microsoft.com/office/drawing/2016/5/12/chartex" xmlns:cx7="http://schemas.microsoft.com/office/drawing/2016/5/13/chartex" xmlns:cx8="http://schemas.microsoft.com/office/drawing/2016/5/14/chartex" xmlns:mc="http://schemas.openxmlformats.org/markup-compatibility/2006" xmlns:m="http://schemas.openxmlformats.org/officeDocument/2006/math" xmlns:aink="http://schemas.microsoft.com/office/drawing/2016/ink" xmlns:am3d="http://schemas.microsoft.com/office/drawing/2017/model3d" xmlns:oel="http://schemas.microsoft.com/office/2019/extlst" xmlns:r="http://schemas.openxmlformats.org/officeDocument/2006/relationships" xmlns:wp14="http://schemas.microsoft.com/office/word/2010/wordprocessingDrawing" xmlns:wp="http://schemas.openxmlformats.org/drawingml/2006/wordprocessingDrawing" xmlns:wpg="http://schemas.microsoft.com/office/word/2010/wordprocessingGroup" xmlns:wpi="http://schemas.microsoft.com/office/word/2010/wordprocessingInk" xmlns:wps="http://schemas.microsoft.com/office/word/2010/wordprocessingShape" xmlns:o="urn:schemas-microsoft-com:office:office" xmlns:v="urn:schemas-microsoft-com:vml" xmlns:w10="urn:schemas-microsoft-com:office:word" xmlns:w="http://schemas.openxmlformats.org/wordprocessingml/2006/main" xmlns:w14="http://schemas.microsoft.com/office/word/2010/wordml" xmlns:w15="http://schemas.microsoft.com/office/word/2012/wordml" xmlns:w16cex="http://schemas.microsoft.com/office/word/2018/wordml/cex" xmlns:w16cid="http://schemas.microsoft.com/office/word/2016/wordml/cid" xmlns:w16="http://schemas.microsoft.com/office/word/2018/wordml" xmlns:w16sdtdh="http://schemas.microsoft.com/office/word/2020/wordml/sdtdatahash" xmlns:w16sdtfl="http://schemas.microsoft.com/office/word/2024/wordml/sdtformatlock" xmlns:w16se="http://schemas.microsoft.com/office/word/2015/wordml/symex" xmlns:w16du="http://schemas.microsoft.com/office/word/2023/wordml/word16du" xmlns:wne="http://schemas.microsoft.com/office/word/2006/wordml" mc:Ignorable="w14 w15 w16se w16cid w16 w16cex w16sdtdh w16sdtfl w16du wp14">
   <w:endnote w:type="separator" w:id="-1">
     <w:p>
       <w:r>
@@ -1702,7 +1749,7 @@
 </file>
 
 <file path=word/footnotes.xml><?xml version="1.0" encoding="utf-8"?>
-<w:footnotes xmlns:wpc="http://schemas.microsoft.com/office/word/2010/wordprocessingCanvas" xmlns:cx="http://schemas.microsoft.com/office/drawing/2014/chartex" xmlns:cx1="http://schemas.microsoft.com/office/drawing/2015/9/8/chartex" xmlns:cx2="http://schemas.microsoft.com/office/drawing/2015/10/21/chartex" xmlns:cx3="http://schemas.microsoft.com/office/drawing/2016/5/9/chartex" xmlns:cx4="http://schemas.microsoft.com/office/drawing/2016/5/10/chartex" xmlns:cx5="http://schemas.microsoft.com/office/drawing/2016/5/11/chartex" xmlns:cx6="http://schemas.microsoft.com/office/drawing/2016/5/12/chartex" xmlns:cx7="http://schemas.microsoft.com/office/drawing/2016/5/13/chartex" xmlns:cx8="http://schemas.microsoft.com/office/drawing/2016/5/14/chartex" xmlns:mc="http://schemas.openxmlformats.org/markup-compatibility/2006" xmlns:aink="http://schemas.microsoft.com/office/drawing/2016/ink" xmlns:am3d="http://schemas.microsoft.com/office/drawing/2017/model3d" xmlns:o="urn:schemas-microsoft-com:office:office" xmlns:oel="http://schemas.microsoft.com/office/2019/extlst" xmlns:r="http://schemas.openxmlformats.org/officeDocument/2006/relationships" xmlns:m="http://schemas.openxmlformats.org/officeDocument/2006/math" xmlns:v="urn:schemas-microsoft-com:vml" xmlns:wp14="http://schemas.microsoft.com/office/word/2010/wordprocessingDrawing" xmlns:wp="http://schemas.openxmlformats.org/drawingml/2006/wordprocessingDrawing" xmlns:w10="urn:schemas-microsoft-com:office:word" xmlns:w="http://schemas.openxmlformats.org/wordprocessingml/2006/main" xmlns:w14="http://schemas.microsoft.com/office/word/2010/wordml" xmlns:w15="http://schemas.microsoft.com/office/word/2012/wordml" xmlns:w16cex="http://schemas.microsoft.com/office/word/2018/wordml/cex" xmlns:w16cid="http://schemas.microsoft.com/office/word/2016/wordml/cid" xmlns:w16="http://schemas.microsoft.com/office/word/2018/wordml" xmlns:w16du="http://schemas.microsoft.com/office/word/2023/wordml/word16du" xmlns:w16sdtdh="http://schemas.microsoft.com/office/word/2020/wordml/sdtdatahash" xmlns:w16sdtfl="http://schemas.microsoft.com/office/word/2024/wordml/sdtformatlock" xmlns:w16se="http://schemas.microsoft.com/office/word/2015/wordml/symex" xmlns:wpg="http://schemas.microsoft.com/office/word/2010/wordprocessingGroup" xmlns:wpi="http://schemas.microsoft.com/office/word/2010/wordprocessingInk" xmlns:wne="http://schemas.microsoft.com/office/word/2006/wordml" xmlns:wps="http://schemas.microsoft.com/office/word/2010/wordprocessingShape" mc:Ignorable="w14 w15 w16se w16cid w16 w16cex w16sdtdh w16sdtfl w16du wp14">
+<w:footnotes xmlns:wpc="http://schemas.microsoft.com/office/word/2010/wordprocessingCanvas" xmlns:cx="http://schemas.microsoft.com/office/drawing/2014/chartex" xmlns:cx1="http://schemas.microsoft.com/office/drawing/2015/9/8/chartex" xmlns:cx2="http://schemas.microsoft.com/office/drawing/2015/10/21/chartex" xmlns:cx3="http://schemas.microsoft.com/office/drawing/2016/5/9/chartex" xmlns:cx4="http://schemas.microsoft.com/office/drawing/2016/5/10/chartex" xmlns:cx5="http://schemas.microsoft.com/office/drawing/2016/5/11/chartex" xmlns:cx6="http://schemas.microsoft.com/office/drawing/2016/5/12/chartex" xmlns:cx7="http://schemas.microsoft.com/office/drawing/2016/5/13/chartex" xmlns:cx8="http://schemas.microsoft.com/office/drawing/2016/5/14/chartex" xmlns:mc="http://schemas.openxmlformats.org/markup-compatibility/2006" xmlns:m="http://schemas.openxmlformats.org/officeDocument/2006/math" xmlns:aink="http://schemas.microsoft.com/office/drawing/2016/ink" xmlns:am3d="http://schemas.microsoft.com/office/drawing/2017/model3d" xmlns:oel="http://schemas.microsoft.com/office/2019/extlst" xmlns:r="http://schemas.openxmlformats.org/officeDocument/2006/relationships" xmlns:wp14="http://schemas.microsoft.com/office/word/2010/wordprocessingDrawing" xmlns:wp="http://schemas.openxmlformats.org/drawingml/2006/wordprocessingDrawing" xmlns:wpg="http://schemas.microsoft.com/office/word/2010/wordprocessingGroup" xmlns:wpi="http://schemas.microsoft.com/office/word/2010/wordprocessingInk" xmlns:wps="http://schemas.microsoft.com/office/word/2010/wordprocessingShape" xmlns:o="urn:schemas-microsoft-com:office:office" xmlns:v="urn:schemas-microsoft-com:vml" xmlns:w10="urn:schemas-microsoft-com:office:word" xmlns:w="http://schemas.openxmlformats.org/wordprocessingml/2006/main" xmlns:w14="http://schemas.microsoft.com/office/word/2010/wordml" xmlns:w15="http://schemas.microsoft.com/office/word/2012/wordml" xmlns:w16cex="http://schemas.microsoft.com/office/word/2018/wordml/cex" xmlns:w16cid="http://schemas.microsoft.com/office/word/2016/wordml/cid" xmlns:w16="http://schemas.microsoft.com/office/word/2018/wordml" xmlns:w16sdtdh="http://schemas.microsoft.com/office/word/2020/wordml/sdtdatahash" xmlns:w16sdtfl="http://schemas.microsoft.com/office/word/2024/wordml/sdtformatlock" xmlns:w16se="http://schemas.microsoft.com/office/word/2015/wordml/symex" xmlns:w16du="http://schemas.microsoft.com/office/word/2023/wordml/word16du" xmlns:wne="http://schemas.microsoft.com/office/word/2006/wordml" mc:Ignorable="w14 w15 w16se w16cid w16 w16cex w16sdtdh w16sdtfl w16du wp14">
   <w:footnote w:type="separator" w:id="-1">
     <w:p>
       <w:r>
@@ -1721,7 +1768,7 @@
 </file>
 
 <file path=word/styles.xml><?xml version="1.0" encoding="utf-8"?>
-<w:styles xmlns:mc="http://schemas.openxmlformats.org/markup-compatibility/2006" xmlns:r="http://schemas.openxmlformats.org/officeDocument/2006/relationships" xmlns:w="http://schemas.openxmlformats.org/wordprocessingml/2006/main" xmlns:w14="http://schemas.microsoft.com/office/word/2010/wordml" xmlns:w15="http://schemas.microsoft.com/office/word/2012/wordml" xmlns:w16cex="http://schemas.microsoft.com/office/word/2018/wordml/cex" xmlns:w16cid="http://schemas.microsoft.com/office/word/2016/wordml/cid" xmlns:w16="http://schemas.microsoft.com/office/word/2018/wordml" xmlns:w16du="http://schemas.microsoft.com/office/word/2023/wordml/word16du" xmlns:w16sdtdh="http://schemas.microsoft.com/office/word/2020/wordml/sdtdatahash" xmlns:w16sdtfl="http://schemas.microsoft.com/office/word/2024/wordml/sdtformatlock" xmlns:w16se="http://schemas.microsoft.com/office/word/2015/wordml/symex" mc:Ignorable="w14 w15 w16se w16cid w16 w16cex w16sdtdh w16sdtfl w16du">
+<w:styles xmlns:mc="http://schemas.openxmlformats.org/markup-compatibility/2006" xmlns:r="http://schemas.openxmlformats.org/officeDocument/2006/relationships" xmlns:w="http://schemas.openxmlformats.org/wordprocessingml/2006/main" xmlns:w14="http://schemas.microsoft.com/office/word/2010/wordml" xmlns:w15="http://schemas.microsoft.com/office/word/2012/wordml" xmlns:w16cex="http://schemas.microsoft.com/office/word/2018/wordml/cex" xmlns:w16cid="http://schemas.microsoft.com/office/word/2016/wordml/cid" xmlns:w16="http://schemas.microsoft.com/office/word/2018/wordml" xmlns:w16sdtdh="http://schemas.microsoft.com/office/word/2020/wordml/sdtdatahash" xmlns:w16sdtfl="http://schemas.microsoft.com/office/word/2024/wordml/sdtformatlock" xmlns:w16se="http://schemas.microsoft.com/office/word/2015/wordml/symex" xmlns:w16du="http://schemas.microsoft.com/office/word/2023/wordml/word16du" mc:Ignorable="w14 w15 w16se w16cid w16 w16cex w16sdtdh w16sdtfl w16du">
   <w:docDefaults>
     <w:rPrDefault>
       <w:rPr>
@@ -2111,7 +2158,7 @@
     <w:lsdException w:name="Unresolved Mention" w:semiHidden="1" w:unhideWhenUsed="1"/>
     <w:lsdException w:name="Smart Link" w:semiHidden="1" w:unhideWhenUsed="1"/>
   </w:latentStyles>
-  <w:style w:type="paragraph" w:default="1" w:styleId="a">
+  <w:style w:type="paragraph" w:default="1" w:styleId="Normal">
     <w:name w:val="Normal"/>
     <w:qFormat/>
     <w:rsid w:val="005D52E8"/>
@@ -2120,11 +2167,11 @@
       <w:szCs w:val="24"/>
     </w:rPr>
   </w:style>
-  <w:style w:type="paragraph" w:styleId="1">
+  <w:style w:type="paragraph" w:styleId="Heading1">
     <w:name w:val="heading 1"/>
-    <w:basedOn w:val="a"/>
-    <w:next w:val="a"/>
-    <w:link w:val="10"/>
+    <w:basedOn w:val="Normal"/>
+    <w:next w:val="Normal"/>
+    <w:link w:val="Heading1Char"/>
     <w:uiPriority w:val="9"/>
     <w:qFormat/>
     <w:rsid w:val="005D52E8"/>
@@ -2142,11 +2189,11 @@
       <w:szCs w:val="32"/>
     </w:rPr>
   </w:style>
-  <w:style w:type="paragraph" w:styleId="2">
+  <w:style w:type="paragraph" w:styleId="Heading2">
     <w:name w:val="heading 2"/>
-    <w:basedOn w:val="a"/>
-    <w:next w:val="a"/>
-    <w:link w:val="20"/>
+    <w:basedOn w:val="Normal"/>
+    <w:next w:val="Normal"/>
+    <w:link w:val="Heading2Char"/>
     <w:uiPriority w:val="9"/>
     <w:semiHidden/>
     <w:unhideWhenUsed/>
@@ -2167,11 +2214,11 @@
       <w:szCs w:val="28"/>
     </w:rPr>
   </w:style>
-  <w:style w:type="paragraph" w:styleId="3">
+  <w:style w:type="paragraph" w:styleId="Heading3">
     <w:name w:val="heading 3"/>
-    <w:basedOn w:val="a"/>
-    <w:next w:val="a"/>
-    <w:link w:val="30"/>
+    <w:basedOn w:val="Normal"/>
+    <w:next w:val="Normal"/>
+    <w:link w:val="Heading3Char"/>
     <w:uiPriority w:val="9"/>
     <w:semiHidden/>
     <w:unhideWhenUsed/>
@@ -2190,11 +2237,11 @@
       <w:szCs w:val="26"/>
     </w:rPr>
   </w:style>
-  <w:style w:type="paragraph" w:styleId="4">
+  <w:style w:type="paragraph" w:styleId="Heading4">
     <w:name w:val="heading 4"/>
-    <w:basedOn w:val="a"/>
-    <w:next w:val="a"/>
-    <w:link w:val="40"/>
+    <w:basedOn w:val="Normal"/>
+    <w:next w:val="Normal"/>
+    <w:link w:val="Heading4Char"/>
     <w:uiPriority w:val="9"/>
     <w:semiHidden/>
     <w:unhideWhenUsed/>
@@ -2212,11 +2259,11 @@
       <w:szCs w:val="28"/>
     </w:rPr>
   </w:style>
-  <w:style w:type="paragraph" w:styleId="5">
+  <w:style w:type="paragraph" w:styleId="Heading5">
     <w:name w:val="heading 5"/>
-    <w:basedOn w:val="a"/>
-    <w:next w:val="a"/>
-    <w:link w:val="50"/>
+    <w:basedOn w:val="Normal"/>
+    <w:next w:val="Normal"/>
+    <w:link w:val="Heading5Char"/>
     <w:uiPriority w:val="9"/>
     <w:semiHidden/>
     <w:unhideWhenUsed/>
@@ -2235,11 +2282,11 @@
       <w:szCs w:val="26"/>
     </w:rPr>
   </w:style>
-  <w:style w:type="paragraph" w:styleId="6">
+  <w:style w:type="paragraph" w:styleId="Heading6">
     <w:name w:val="heading 6"/>
-    <w:basedOn w:val="a"/>
-    <w:next w:val="a"/>
-    <w:link w:val="60"/>
+    <w:basedOn w:val="Normal"/>
+    <w:next w:val="Normal"/>
+    <w:link w:val="Heading6Char"/>
     <w:uiPriority w:val="9"/>
     <w:semiHidden/>
     <w:unhideWhenUsed/>
@@ -2256,11 +2303,11 @@
       <w:szCs w:val="22"/>
     </w:rPr>
   </w:style>
-  <w:style w:type="paragraph" w:styleId="7">
+  <w:style w:type="paragraph" w:styleId="Heading7">
     <w:name w:val="heading 7"/>
-    <w:basedOn w:val="a"/>
-    <w:next w:val="a"/>
-    <w:link w:val="70"/>
+    <w:basedOn w:val="Normal"/>
+    <w:next w:val="Normal"/>
+    <w:link w:val="Heading7Char"/>
     <w:uiPriority w:val="9"/>
     <w:semiHidden/>
     <w:unhideWhenUsed/>
@@ -2271,11 +2318,11 @@
       <w:outlineLvl w:val="6"/>
     </w:pPr>
   </w:style>
-  <w:style w:type="paragraph" w:styleId="8">
+  <w:style w:type="paragraph" w:styleId="Heading8">
     <w:name w:val="heading 8"/>
-    <w:basedOn w:val="a"/>
-    <w:next w:val="a"/>
-    <w:link w:val="80"/>
+    <w:basedOn w:val="Normal"/>
+    <w:next w:val="Normal"/>
+    <w:link w:val="Heading8Char"/>
     <w:uiPriority w:val="9"/>
     <w:semiHidden/>
     <w:unhideWhenUsed/>
@@ -2290,11 +2337,11 @@
       <w:iCs/>
     </w:rPr>
   </w:style>
-  <w:style w:type="paragraph" w:styleId="9">
+  <w:style w:type="paragraph" w:styleId="Heading9">
     <w:name w:val="heading 9"/>
-    <w:basedOn w:val="a"/>
-    <w:next w:val="a"/>
-    <w:link w:val="90"/>
+    <w:basedOn w:val="Normal"/>
+    <w:next w:val="Normal"/>
+    <w:link w:val="Heading9Char"/>
     <w:uiPriority w:val="9"/>
     <w:semiHidden/>
     <w:unhideWhenUsed/>
@@ -2310,13 +2357,13 @@
       <w:szCs w:val="22"/>
     </w:rPr>
   </w:style>
-  <w:style w:type="character" w:default="1" w:styleId="a0">
+  <w:style w:type="character" w:default="1" w:styleId="DefaultParagraphFont">
     <w:name w:val="Default Paragraph Font"/>
     <w:uiPriority w:val="1"/>
     <w:semiHidden/>
     <w:unhideWhenUsed/>
   </w:style>
-  <w:style w:type="table" w:default="1" w:styleId="a1">
+  <w:style w:type="table" w:default="1" w:styleId="TableNormal">
     <w:name w:val="Normal Table"/>
     <w:uiPriority w:val="99"/>
     <w:semiHidden/>
@@ -2331,15 +2378,15 @@
       </w:tblCellMar>
     </w:tblPr>
   </w:style>
-  <w:style w:type="numbering" w:default="1" w:styleId="a2">
+  <w:style w:type="numbering" w:default="1" w:styleId="NoList">
     <w:name w:val="No List"/>
     <w:uiPriority w:val="99"/>
     <w:semiHidden/>
     <w:unhideWhenUsed/>
   </w:style>
-  <w:style w:type="paragraph" w:styleId="a3">
+  <w:style w:type="paragraph" w:styleId="NormalWeb">
     <w:name w:val="Normal (Web)"/>
-    <w:basedOn w:val="a"/>
+    <w:basedOn w:val="Normal"/>
     <w:uiPriority w:val="99"/>
     <w:semiHidden/>
     <w:unhideWhenUsed/>
@@ -2354,13 +2401,13 @@
   </w:style>
   <w:style w:type="character" w:customStyle="1" w:styleId="apple-tab-span">
     <w:name w:val="apple-tab-span"/>
-    <w:basedOn w:val="a0"/>
+    <w:basedOn w:val="DefaultParagraphFont"/>
     <w:rsid w:val="000463DB"/>
   </w:style>
-  <w:style w:type="paragraph" w:styleId="a4">
+  <w:style w:type="paragraph" w:styleId="BalloonText">
     <w:name w:val="Balloon Text"/>
-    <w:basedOn w:val="a"/>
-    <w:link w:val="a5"/>
+    <w:basedOn w:val="Normal"/>
+    <w:link w:val="BalloonTextChar"/>
     <w:uiPriority w:val="99"/>
     <w:semiHidden/>
     <w:unhideWhenUsed/>
@@ -2371,10 +2418,10 @@
       <w:szCs w:val="22"/>
     </w:rPr>
   </w:style>
-  <w:style w:type="character" w:customStyle="1" w:styleId="a5">
-    <w:name w:val="ข้อความบอลลูน อักขระ"/>
-    <w:basedOn w:val="a0"/>
-    <w:link w:val="a4"/>
+  <w:style w:type="character" w:customStyle="1" w:styleId="BalloonTextChar">
+    <w:name w:val="Balloon Text Char"/>
+    <w:basedOn w:val="DefaultParagraphFont"/>
+    <w:link w:val="BalloonText"/>
     <w:uiPriority w:val="99"/>
     <w:semiHidden/>
     <w:rsid w:val="000C52FD"/>
@@ -2384,10 +2431,10 @@
       <w:szCs w:val="22"/>
     </w:rPr>
   </w:style>
-  <w:style w:type="paragraph" w:styleId="a6">
+  <w:style w:type="paragraph" w:styleId="Header">
     <w:name w:val="header"/>
-    <w:basedOn w:val="a"/>
-    <w:link w:val="a7"/>
+    <w:basedOn w:val="Normal"/>
+    <w:link w:val="HeaderChar"/>
     <w:uiPriority w:val="99"/>
     <w:unhideWhenUsed/>
     <w:rsid w:val="002E55A6"/>
@@ -2398,17 +2445,17 @@
       </w:tabs>
     </w:pPr>
   </w:style>
-  <w:style w:type="character" w:customStyle="1" w:styleId="a7">
-    <w:name w:val="หัวกระดาษ อักขระ"/>
-    <w:basedOn w:val="a0"/>
-    <w:link w:val="a6"/>
+  <w:style w:type="character" w:customStyle="1" w:styleId="HeaderChar">
+    <w:name w:val="Header Char"/>
+    <w:basedOn w:val="DefaultParagraphFont"/>
+    <w:link w:val="Header"/>
     <w:uiPriority w:val="99"/>
     <w:rsid w:val="002E55A6"/>
   </w:style>
-  <w:style w:type="paragraph" w:styleId="a8">
+  <w:style w:type="paragraph" w:styleId="Footer">
     <w:name w:val="footer"/>
-    <w:basedOn w:val="a"/>
-    <w:link w:val="a9"/>
+    <w:basedOn w:val="Normal"/>
+    <w:link w:val="FooterChar"/>
     <w:uiPriority w:val="99"/>
     <w:unhideWhenUsed/>
     <w:rsid w:val="002E55A6"/>
@@ -2419,17 +2466,17 @@
       </w:tabs>
     </w:pPr>
   </w:style>
-  <w:style w:type="character" w:customStyle="1" w:styleId="a9">
-    <w:name w:val="ท้ายกระดาษ อักขระ"/>
-    <w:basedOn w:val="a0"/>
-    <w:link w:val="a8"/>
+  <w:style w:type="character" w:customStyle="1" w:styleId="FooterChar">
+    <w:name w:val="Footer Char"/>
+    <w:basedOn w:val="DefaultParagraphFont"/>
+    <w:link w:val="Footer"/>
     <w:uiPriority w:val="99"/>
     <w:rsid w:val="002E55A6"/>
   </w:style>
-  <w:style w:type="character" w:customStyle="1" w:styleId="10">
-    <w:name w:val="หัวเรื่อง 1 อักขระ"/>
-    <w:basedOn w:val="a0"/>
-    <w:link w:val="1"/>
+  <w:style w:type="character" w:customStyle="1" w:styleId="Heading1Char">
+    <w:name w:val="Heading 1 Char"/>
+    <w:basedOn w:val="DefaultParagraphFont"/>
+    <w:link w:val="Heading1"/>
     <w:uiPriority w:val="9"/>
     <w:rsid w:val="005D52E8"/>
     <w:rPr>
@@ -2441,10 +2488,10 @@
       <w:szCs w:val="32"/>
     </w:rPr>
   </w:style>
-  <w:style w:type="character" w:customStyle="1" w:styleId="20">
-    <w:name w:val="หัวเรื่อง 2 อักขระ"/>
-    <w:basedOn w:val="a0"/>
-    <w:link w:val="2"/>
+  <w:style w:type="character" w:customStyle="1" w:styleId="Heading2Char">
+    <w:name w:val="Heading 2 Char"/>
+    <w:basedOn w:val="DefaultParagraphFont"/>
+    <w:link w:val="Heading2"/>
     <w:uiPriority w:val="9"/>
     <w:semiHidden/>
     <w:rsid w:val="005D52E8"/>
@@ -2458,10 +2505,10 @@
       <w:szCs w:val="28"/>
     </w:rPr>
   </w:style>
-  <w:style w:type="character" w:customStyle="1" w:styleId="30">
-    <w:name w:val="หัวเรื่อง 3 อักขระ"/>
-    <w:basedOn w:val="a0"/>
-    <w:link w:val="3"/>
+  <w:style w:type="character" w:customStyle="1" w:styleId="Heading3Char">
+    <w:name w:val="Heading 3 Char"/>
+    <w:basedOn w:val="DefaultParagraphFont"/>
+    <w:link w:val="Heading3"/>
     <w:uiPriority w:val="9"/>
     <w:semiHidden/>
     <w:rsid w:val="005D52E8"/>
@@ -2473,10 +2520,10 @@
       <w:szCs w:val="26"/>
     </w:rPr>
   </w:style>
-  <w:style w:type="character" w:customStyle="1" w:styleId="40">
-    <w:name w:val="หัวเรื่อง 4 อักขระ"/>
-    <w:basedOn w:val="a0"/>
-    <w:link w:val="4"/>
+  <w:style w:type="character" w:customStyle="1" w:styleId="Heading4Char">
+    <w:name w:val="Heading 4 Char"/>
+    <w:basedOn w:val="DefaultParagraphFont"/>
+    <w:link w:val="Heading4"/>
     <w:uiPriority w:val="9"/>
     <w:semiHidden/>
     <w:rsid w:val="005D52E8"/>
@@ -2487,10 +2534,10 @@
       <w:szCs w:val="28"/>
     </w:rPr>
   </w:style>
-  <w:style w:type="character" w:customStyle="1" w:styleId="50">
-    <w:name w:val="หัวเรื่อง 5 อักขระ"/>
-    <w:basedOn w:val="a0"/>
-    <w:link w:val="5"/>
+  <w:style w:type="character" w:customStyle="1" w:styleId="Heading5Char">
+    <w:name w:val="Heading 5 Char"/>
+    <w:basedOn w:val="DefaultParagraphFont"/>
+    <w:link w:val="Heading5"/>
     <w:uiPriority w:val="9"/>
     <w:semiHidden/>
     <w:rsid w:val="005D52E8"/>
@@ -2503,10 +2550,10 @@
       <w:szCs w:val="26"/>
     </w:rPr>
   </w:style>
-  <w:style w:type="character" w:customStyle="1" w:styleId="60">
-    <w:name w:val="หัวเรื่อง 6 อักขระ"/>
-    <w:basedOn w:val="a0"/>
-    <w:link w:val="6"/>
+  <w:style w:type="character" w:customStyle="1" w:styleId="Heading6Char">
+    <w:name w:val="Heading 6 Char"/>
+    <w:basedOn w:val="DefaultParagraphFont"/>
+    <w:link w:val="Heading6"/>
     <w:uiPriority w:val="9"/>
     <w:semiHidden/>
     <w:rsid w:val="005D52E8"/>
@@ -2515,10 +2562,10 @@
       <w:bCs/>
     </w:rPr>
   </w:style>
-  <w:style w:type="character" w:customStyle="1" w:styleId="70">
-    <w:name w:val="หัวเรื่อง 7 อักขระ"/>
-    <w:basedOn w:val="a0"/>
-    <w:link w:val="7"/>
+  <w:style w:type="character" w:customStyle="1" w:styleId="Heading7Char">
+    <w:name w:val="Heading 7 Char"/>
+    <w:basedOn w:val="DefaultParagraphFont"/>
+    <w:link w:val="Heading7"/>
     <w:uiPriority w:val="9"/>
     <w:semiHidden/>
     <w:rsid w:val="005D52E8"/>
@@ -2527,10 +2574,10 @@
       <w:szCs w:val="24"/>
     </w:rPr>
   </w:style>
-  <w:style w:type="character" w:customStyle="1" w:styleId="80">
-    <w:name w:val="หัวเรื่อง 8 อักขระ"/>
-    <w:basedOn w:val="a0"/>
-    <w:link w:val="8"/>
+  <w:style w:type="character" w:customStyle="1" w:styleId="Heading8Char">
+    <w:name w:val="Heading 8 Char"/>
+    <w:basedOn w:val="DefaultParagraphFont"/>
+    <w:link w:val="Heading8"/>
     <w:uiPriority w:val="9"/>
     <w:semiHidden/>
     <w:rsid w:val="005D52E8"/>
@@ -2541,10 +2588,10 @@
       <w:szCs w:val="24"/>
     </w:rPr>
   </w:style>
-  <w:style w:type="character" w:customStyle="1" w:styleId="90">
-    <w:name w:val="หัวเรื่อง 9 อักขระ"/>
-    <w:basedOn w:val="a0"/>
-    <w:link w:val="9"/>
+  <w:style w:type="character" w:customStyle="1" w:styleId="Heading9Char">
+    <w:name w:val="Heading 9 Char"/>
+    <w:basedOn w:val="DefaultParagraphFont"/>
+    <w:link w:val="Heading9"/>
     <w:uiPriority w:val="9"/>
     <w:semiHidden/>
     <w:rsid w:val="005D52E8"/>
@@ -2552,11 +2599,11 @@
       <w:rFonts w:asciiTheme="majorHAnsi" w:eastAsiaTheme="majorEastAsia" w:hAnsiTheme="majorHAnsi"/>
     </w:rPr>
   </w:style>
-  <w:style w:type="paragraph" w:styleId="aa">
+  <w:style w:type="paragraph" w:styleId="Title">
     <w:name w:val="Title"/>
-    <w:basedOn w:val="a"/>
-    <w:next w:val="a"/>
-    <w:link w:val="ab"/>
+    <w:basedOn w:val="Normal"/>
+    <w:next w:val="Normal"/>
+    <w:link w:val="TitleChar"/>
     <w:uiPriority w:val="10"/>
     <w:qFormat/>
     <w:rsid w:val="005D52E8"/>
@@ -2574,10 +2621,10 @@
       <w:szCs w:val="32"/>
     </w:rPr>
   </w:style>
-  <w:style w:type="character" w:customStyle="1" w:styleId="ab">
-    <w:name w:val="ชื่อเรื่อง อักขระ"/>
-    <w:basedOn w:val="a0"/>
-    <w:link w:val="aa"/>
+  <w:style w:type="character" w:customStyle="1" w:styleId="TitleChar">
+    <w:name w:val="Title Char"/>
+    <w:basedOn w:val="DefaultParagraphFont"/>
+    <w:link w:val="Title"/>
     <w:uiPriority w:val="10"/>
     <w:rsid w:val="005D52E8"/>
     <w:rPr>
@@ -2589,11 +2636,11 @@
       <w:szCs w:val="32"/>
     </w:rPr>
   </w:style>
-  <w:style w:type="paragraph" w:styleId="ac">
+  <w:style w:type="paragraph" w:styleId="Subtitle">
     <w:name w:val="Subtitle"/>
-    <w:basedOn w:val="a"/>
-    <w:next w:val="a"/>
-    <w:link w:val="ad"/>
+    <w:basedOn w:val="Normal"/>
+    <w:next w:val="Normal"/>
+    <w:link w:val="SubtitleChar"/>
     <w:uiPriority w:val="11"/>
     <w:qFormat/>
     <w:rsid w:val="005D52E8"/>
@@ -2606,10 +2653,10 @@
       <w:rFonts w:asciiTheme="majorHAnsi" w:eastAsiaTheme="majorEastAsia" w:hAnsiTheme="majorHAnsi"/>
     </w:rPr>
   </w:style>
-  <w:style w:type="character" w:customStyle="1" w:styleId="ad">
-    <w:name w:val="ชื่อเรื่องรอง อักขระ"/>
-    <w:basedOn w:val="a0"/>
-    <w:link w:val="ac"/>
+  <w:style w:type="character" w:customStyle="1" w:styleId="SubtitleChar">
+    <w:name w:val="Subtitle Char"/>
+    <w:basedOn w:val="DefaultParagraphFont"/>
+    <w:link w:val="Subtitle"/>
     <w:uiPriority w:val="11"/>
     <w:rsid w:val="005D52E8"/>
     <w:rPr>
@@ -2618,9 +2665,9 @@
       <w:szCs w:val="24"/>
     </w:rPr>
   </w:style>
-  <w:style w:type="character" w:styleId="ae">
+  <w:style w:type="character" w:styleId="Strong">
     <w:name w:val="Strong"/>
-    <w:basedOn w:val="a0"/>
+    <w:basedOn w:val="DefaultParagraphFont"/>
     <w:uiPriority w:val="22"/>
     <w:qFormat/>
     <w:rsid w:val="005D52E8"/>
@@ -2629,9 +2676,9 @@
       <w:bCs/>
     </w:rPr>
   </w:style>
-  <w:style w:type="character" w:styleId="af">
+  <w:style w:type="character" w:styleId="Emphasis">
     <w:name w:val="Emphasis"/>
-    <w:basedOn w:val="a0"/>
+    <w:basedOn w:val="DefaultParagraphFont"/>
     <w:uiPriority w:val="20"/>
     <w:qFormat/>
     <w:rsid w:val="005D52E8"/>
@@ -2642,9 +2689,9 @@
       <w:iCs/>
     </w:rPr>
   </w:style>
-  <w:style w:type="paragraph" w:styleId="af0">
+  <w:style w:type="paragraph" w:styleId="NoSpacing">
     <w:name w:val="No Spacing"/>
-    <w:basedOn w:val="a"/>
+    <w:basedOn w:val="Normal"/>
     <w:uiPriority w:val="1"/>
     <w:qFormat/>
     <w:rsid w:val="005D52E8"/>
@@ -2652,9 +2699,9 @@
       <w:szCs w:val="32"/>
     </w:rPr>
   </w:style>
-  <w:style w:type="paragraph" w:styleId="af1">
+  <w:style w:type="paragraph" w:styleId="ListParagraph">
     <w:name w:val="List Paragraph"/>
-    <w:basedOn w:val="a"/>
+    <w:basedOn w:val="Normal"/>
     <w:uiPriority w:val="34"/>
     <w:qFormat/>
     <w:rsid w:val="005D52E8"/>
@@ -2663,11 +2710,11 @@
       <w:contextualSpacing/>
     </w:pPr>
   </w:style>
-  <w:style w:type="paragraph" w:styleId="af2">
+  <w:style w:type="paragraph" w:styleId="Quote">
     <w:name w:val="Quote"/>
-    <w:basedOn w:val="a"/>
-    <w:next w:val="a"/>
-    <w:link w:val="af3"/>
+    <w:basedOn w:val="Normal"/>
+    <w:next w:val="Normal"/>
+    <w:link w:val="QuoteChar"/>
     <w:uiPriority w:val="29"/>
     <w:qFormat/>
     <w:rsid w:val="005D52E8"/>
@@ -2675,10 +2722,10 @@
       <w:i/>
     </w:rPr>
   </w:style>
-  <w:style w:type="character" w:customStyle="1" w:styleId="af3">
-    <w:name w:val="คำอ้างอิง อักขระ"/>
-    <w:basedOn w:val="a0"/>
-    <w:link w:val="af2"/>
+  <w:style w:type="character" w:customStyle="1" w:styleId="QuoteChar">
+    <w:name w:val="Quote Char"/>
+    <w:basedOn w:val="DefaultParagraphFont"/>
+    <w:link w:val="Quote"/>
     <w:uiPriority w:val="29"/>
     <w:rsid w:val="005D52E8"/>
     <w:rPr>
@@ -2687,11 +2734,11 @@
       <w:szCs w:val="24"/>
     </w:rPr>
   </w:style>
-  <w:style w:type="paragraph" w:styleId="af4">
+  <w:style w:type="paragraph" w:styleId="IntenseQuote">
     <w:name w:val="Intense Quote"/>
-    <w:basedOn w:val="a"/>
-    <w:next w:val="a"/>
-    <w:link w:val="af5"/>
+    <w:basedOn w:val="Normal"/>
+    <w:next w:val="Normal"/>
+    <w:link w:val="IntenseQuoteChar"/>
     <w:uiPriority w:val="30"/>
     <w:qFormat/>
     <w:rsid w:val="005D52E8"/>
@@ -2704,10 +2751,10 @@
       <w:szCs w:val="22"/>
     </w:rPr>
   </w:style>
-  <w:style w:type="character" w:customStyle="1" w:styleId="af5">
-    <w:name w:val="ทำให้คำอ้างอิงเป็นสีเข้มขึ้น อักขระ"/>
-    <w:basedOn w:val="a0"/>
-    <w:link w:val="af4"/>
+  <w:style w:type="character" w:customStyle="1" w:styleId="IntenseQuoteChar">
+    <w:name w:val="Intense Quote Char"/>
+    <w:basedOn w:val="DefaultParagraphFont"/>
+    <w:link w:val="IntenseQuote"/>
     <w:uiPriority w:val="30"/>
     <w:rsid w:val="005D52E8"/>
     <w:rPr>
@@ -2716,7 +2763,7 @@
       <w:sz w:val="24"/>
     </w:rPr>
   </w:style>
-  <w:style w:type="character" w:styleId="af6">
+  <w:style w:type="character" w:styleId="SubtleEmphasis">
     <w:name w:val="Subtle Emphasis"/>
     <w:uiPriority w:val="19"/>
     <w:qFormat/>
@@ -2726,9 +2773,9 @@
       <w:color w:val="5A5A5A" w:themeColor="text1" w:themeTint="A5"/>
     </w:rPr>
   </w:style>
-  <w:style w:type="character" w:styleId="af7">
+  <w:style w:type="character" w:styleId="IntenseEmphasis">
     <w:name w:val="Intense Emphasis"/>
-    <w:basedOn w:val="a0"/>
+    <w:basedOn w:val="DefaultParagraphFont"/>
     <w:uiPriority w:val="21"/>
     <w:qFormat/>
     <w:rsid w:val="005D52E8"/>
@@ -2740,9 +2787,9 @@
       <w:u w:val="single"/>
     </w:rPr>
   </w:style>
-  <w:style w:type="character" w:styleId="af8">
+  <w:style w:type="character" w:styleId="SubtleReference">
     <w:name w:val="Subtle Reference"/>
-    <w:basedOn w:val="a0"/>
+    <w:basedOn w:val="DefaultParagraphFont"/>
     <w:uiPriority w:val="31"/>
     <w:qFormat/>
     <w:rsid w:val="005D52E8"/>
@@ -2752,9 +2799,9 @@
       <w:u w:val="single"/>
     </w:rPr>
   </w:style>
-  <w:style w:type="character" w:styleId="af9">
+  <w:style w:type="character" w:styleId="IntenseReference">
     <w:name w:val="Intense Reference"/>
-    <w:basedOn w:val="a0"/>
+    <w:basedOn w:val="DefaultParagraphFont"/>
     <w:uiPriority w:val="32"/>
     <w:qFormat/>
     <w:rsid w:val="005D52E8"/>
@@ -2764,9 +2811,9 @@
       <w:u w:val="single"/>
     </w:rPr>
   </w:style>
-  <w:style w:type="character" w:styleId="afa">
+  <w:style w:type="character" w:styleId="BookTitle">
     <w:name w:val="Book Title"/>
-    <w:basedOn w:val="a0"/>
+    <w:basedOn w:val="DefaultParagraphFont"/>
     <w:uiPriority w:val="33"/>
     <w:qFormat/>
     <w:rsid w:val="005D52E8"/>
@@ -2778,10 +2825,10 @@
       <w:szCs w:val="24"/>
     </w:rPr>
   </w:style>
-  <w:style w:type="paragraph" w:styleId="afb">
+  <w:style w:type="paragraph" w:styleId="TOCHeading">
     <w:name w:val="TOC Heading"/>
-    <w:basedOn w:val="1"/>
-    <w:next w:val="a"/>
+    <w:basedOn w:val="Heading1"/>
+    <w:next w:val="Normal"/>
     <w:uiPriority w:val="39"/>
     <w:semiHidden/>
     <w:unhideWhenUsed/>
@@ -2791,9 +2838,9 @@
       <w:outlineLvl w:val="9"/>
     </w:pPr>
   </w:style>
-  <w:style w:type="table" w:styleId="afc">
+  <w:style w:type="table" w:styleId="TableGrid">
     <w:name w:val="Table Grid"/>
-    <w:basedOn w:val="a1"/>
+    <w:basedOn w:val="TableNormal"/>
     <w:uiPriority w:val="39"/>
     <w:rsid w:val="005E088A"/>
     <w:tblPr>

</xml_diff>

<commit_message>
Fix scoring and autofill across admin docs
Refines academic document generation and form behavior for docs 0/3/4/6/7/8. Evaluation level is now derived from actual total score ranges (no rounding), with a fallback computation when doc 6 data is missing `eval_result_level`, and downstream fields use the correct `applicant_name` source. Placeholder preprocessing was centralized and extended so doc 7 meeting/signature date fields render Thai digits only at generation time. UI updates also improve memo/reference defaults and labels, make doc 8 reference fields read-only from doc 0, and prevent Thai date picker/autofill from modifying readonly or disabled fields. DOCX templates for docs 0, 3, 7, and 8 were updated to match these changes.
</commit_message>
<xml_diff>
--- a/HRCP-KKU-Academic/src/main/resources/templates/docx/doc_0.docx
+++ b/HRCP-KKU-Academic/src/main/resources/templates/docx/doc_0.docx
@@ -1,6 +1,6 @@
 
 <file path=word/document.xml><?xml version="1.0" encoding="utf-8"?>
-<w:document xmlns:wpc="http://schemas.microsoft.com/office/word/2010/wordprocessingCanvas" xmlns:cx="http://schemas.microsoft.com/office/drawing/2014/chartex" xmlns:cx1="http://schemas.microsoft.com/office/drawing/2015/9/8/chartex" xmlns:cx2="http://schemas.microsoft.com/office/drawing/2015/10/21/chartex" xmlns:cx3="http://schemas.microsoft.com/office/drawing/2016/5/9/chartex" xmlns:cx4="http://schemas.microsoft.com/office/drawing/2016/5/10/chartex" xmlns:cx5="http://schemas.microsoft.com/office/drawing/2016/5/11/chartex" xmlns:cx6="http://schemas.microsoft.com/office/drawing/2016/5/12/chartex" xmlns:cx7="http://schemas.microsoft.com/office/drawing/2016/5/13/chartex" xmlns:cx8="http://schemas.microsoft.com/office/drawing/2016/5/14/chartex" xmlns:mc="http://schemas.openxmlformats.org/markup-compatibility/2006" xmlns:m="http://schemas.openxmlformats.org/officeDocument/2006/math" xmlns:aink="http://schemas.microsoft.com/office/drawing/2016/ink" xmlns:am3d="http://schemas.microsoft.com/office/drawing/2017/model3d" xmlns:oel="http://schemas.microsoft.com/office/2019/extlst" xmlns:r="http://schemas.openxmlformats.org/officeDocument/2006/relationships" xmlns:wp14="http://schemas.microsoft.com/office/word/2010/wordprocessingDrawing" xmlns:wp="http://schemas.openxmlformats.org/drawingml/2006/wordprocessingDrawing" xmlns:wpg="http://schemas.microsoft.com/office/word/2010/wordprocessingGroup" xmlns:wpi="http://schemas.microsoft.com/office/word/2010/wordprocessingInk" xmlns:wps="http://schemas.microsoft.com/office/word/2010/wordprocessingShape" xmlns:o="urn:schemas-microsoft-com:office:office" xmlns:v="urn:schemas-microsoft-com:vml" xmlns:w10="urn:schemas-microsoft-com:office:word" xmlns:w="http://schemas.openxmlformats.org/wordprocessingml/2006/main" xmlns:w14="http://schemas.microsoft.com/office/word/2010/wordml" xmlns:w15="http://schemas.microsoft.com/office/word/2012/wordml" xmlns:w16cex="http://schemas.microsoft.com/office/word/2018/wordml/cex" xmlns:w16cid="http://schemas.microsoft.com/office/word/2016/wordml/cid" xmlns:w16="http://schemas.microsoft.com/office/word/2018/wordml" xmlns:w16sdtdh="http://schemas.microsoft.com/office/word/2020/wordml/sdtdatahash" xmlns:w16sdtfl="http://schemas.microsoft.com/office/word/2024/wordml/sdtformatlock" xmlns:w16se="http://schemas.microsoft.com/office/word/2015/wordml/symex" xmlns:w16du="http://schemas.microsoft.com/office/word/2023/wordml/word16du" xmlns:wne="http://schemas.microsoft.com/office/word/2006/wordml" mc:Ignorable="w14 w15 w16se w16cid w16 w16cex w16sdtdh w16sdtfl w16du wp14">
+<w:document xmlns:wpc="http://schemas.microsoft.com/office/word/2010/wordprocessingCanvas" xmlns:cx="http://schemas.microsoft.com/office/drawing/2014/chartex" xmlns:cx1="http://schemas.microsoft.com/office/drawing/2015/9/8/chartex" xmlns:cx2="http://schemas.microsoft.com/office/drawing/2015/10/21/chartex" xmlns:cx3="http://schemas.microsoft.com/office/drawing/2016/5/9/chartex" xmlns:cx4="http://schemas.microsoft.com/office/drawing/2016/5/10/chartex" xmlns:cx5="http://schemas.microsoft.com/office/drawing/2016/5/11/chartex" xmlns:cx6="http://schemas.microsoft.com/office/drawing/2016/5/12/chartex" xmlns:cx7="http://schemas.microsoft.com/office/drawing/2016/5/13/chartex" xmlns:cx8="http://schemas.microsoft.com/office/drawing/2016/5/14/chartex" xmlns:mc="http://schemas.openxmlformats.org/markup-compatibility/2006" xmlns:aink="http://schemas.microsoft.com/office/drawing/2016/ink" xmlns:am3d="http://schemas.microsoft.com/office/drawing/2017/model3d" xmlns:o="urn:schemas-microsoft-com:office:office" xmlns:oel="http://schemas.microsoft.com/office/2019/extlst" xmlns:r="http://schemas.openxmlformats.org/officeDocument/2006/relationships" xmlns:m="http://schemas.openxmlformats.org/officeDocument/2006/math" xmlns:v="urn:schemas-microsoft-com:vml" xmlns:wp14="http://schemas.microsoft.com/office/word/2010/wordprocessingDrawing" xmlns:wp="http://schemas.openxmlformats.org/drawingml/2006/wordprocessingDrawing" xmlns:w10="urn:schemas-microsoft-com:office:word" xmlns:w="http://schemas.openxmlformats.org/wordprocessingml/2006/main" xmlns:w14="http://schemas.microsoft.com/office/word/2010/wordml" xmlns:w15="http://schemas.microsoft.com/office/word/2012/wordml" xmlns:w16cex="http://schemas.microsoft.com/office/word/2018/wordml/cex" xmlns:w16cid="http://schemas.microsoft.com/office/word/2016/wordml/cid" xmlns:w16="http://schemas.microsoft.com/office/word/2018/wordml" xmlns:w16du="http://schemas.microsoft.com/office/word/2023/wordml/word16du" xmlns:w16sdtdh="http://schemas.microsoft.com/office/word/2020/wordml/sdtdatahash" xmlns:w16sdtfl="http://schemas.microsoft.com/office/word/2024/wordml/sdtformatlock" xmlns:w16se="http://schemas.microsoft.com/office/word/2015/wordml/symex" xmlns:wpg="http://schemas.microsoft.com/office/word/2010/wordprocessingGroup" xmlns:wpi="http://schemas.microsoft.com/office/word/2010/wordprocessingInk" xmlns:wne="http://schemas.microsoft.com/office/word/2006/wordml" xmlns:wps="http://schemas.microsoft.com/office/word/2010/wordprocessingShape" mc:Ignorable="w14 w15 w16se w16cid w16 w16cex w16sdtdh w16sdtfl w16du wp14">
   <w:body>
     <w:p>
       <w:pPr>
@@ -28,7 +28,7 @@
           <w:lang w:val="en-US"/>
         </w:rPr>
         <w:drawing>
-          <wp:anchor distT="0" distB="0" distL="114300" distR="114300" simplePos="0" relativeHeight="251659264" behindDoc="0" locked="1" layoutInCell="1" allowOverlap="1" wp14:anchorId="68A6F703" wp14:editId="675661B3">
+          <wp:anchor distT="0" distB="0" distL="114300" distR="114300" simplePos="0" relativeHeight="251659264" behindDoc="0" locked="1" layoutInCell="1" allowOverlap="1" wp14:anchorId="68A6F703" wp14:editId="6AF9D51D">
             <wp:simplePos x="0" y="0"/>
             <wp:positionH relativeFrom="margin">
               <wp:posOffset>0</wp:posOffset>
@@ -227,91 +227,7 @@
           <w:szCs w:val="32"/>
           <w:lang w:eastAsia="en-GB"/>
         </w:rPr>
-        <w:t xml:space="preserve">  </w:t>
-      </w:r>
-      <w:r>
-        <w:rPr>
-          <w:rFonts w:ascii="TH Sarabun New" w:eastAsia="Times New Roman" w:hAnsi="TH Sarabun New" w:cs="TH Sarabun New"/>
-          <w:color w:val="000000" w:themeColor="text1"/>
-          <w:sz w:val="32"/>
-          <w:szCs w:val="32"/>
-          <w:cs/>
-          <w:lang w:eastAsia="en-GB"/>
-        </w:rPr>
-        <w:t xml:space="preserve">อว </w:t>
-      </w:r>
-      <w:r>
-        <w:rPr>
-          <w:rFonts w:ascii="TH Sarabun New" w:eastAsia="Times New Roman" w:hAnsi="TH Sarabun New" w:cs="TH Sarabun New"/>
-          <w:color w:val="000000" w:themeColor="text1"/>
-          <w:sz w:val="32"/>
-          <w:szCs w:val="32"/>
-          <w:lang w:eastAsia="en-GB"/>
-        </w:rPr>
-        <w:t>660301</w:t>
-      </w:r>
-      <w:r>
-        <w:rPr>
-          <w:rFonts w:ascii="TH Sarabun New" w:eastAsia="Times New Roman" w:hAnsi="TH Sarabun New" w:cs="TH Sarabun New"/>
-          <w:color w:val="000000" w:themeColor="text1"/>
-          <w:sz w:val="32"/>
-          <w:szCs w:val="32"/>
-          <w:cs/>
-          <w:lang w:eastAsia="en-GB"/>
-        </w:rPr>
-        <w:t>.</w:t>
-      </w:r>
-      <w:r>
-        <w:rPr>
-          <w:rFonts w:ascii="TH Sarabun New" w:eastAsia="Times New Roman" w:hAnsi="TH Sarabun New" w:cs="TH Sarabun New"/>
-          <w:color w:val="000000" w:themeColor="text1"/>
-          <w:sz w:val="32"/>
-          <w:szCs w:val="32"/>
-          <w:lang w:eastAsia="en-GB"/>
-        </w:rPr>
-        <w:t>26</w:t>
-      </w:r>
-      <w:r>
-        <w:rPr>
-          <w:rFonts w:ascii="TH Sarabun New" w:eastAsia="Times New Roman" w:hAnsi="TH Sarabun New" w:cs="TH Sarabun New"/>
-          <w:color w:val="000000" w:themeColor="text1"/>
-          <w:sz w:val="32"/>
-          <w:szCs w:val="32"/>
-          <w:cs/>
-          <w:lang w:eastAsia="en-GB"/>
-        </w:rPr>
-        <w:t>.</w:t>
-      </w:r>
-      <w:r>
-        <w:rPr>
-          <w:rFonts w:ascii="TH Sarabun New" w:eastAsia="Times New Roman" w:hAnsi="TH Sarabun New" w:cs="TH Sarabun New"/>
-          <w:color w:val="000000" w:themeColor="text1"/>
-          <w:sz w:val="32"/>
-          <w:szCs w:val="32"/>
-          <w:lang w:eastAsia="en-GB"/>
-        </w:rPr>
-        <w:t>8</w:t>
-      </w:r>
-      <w:r>
-        <w:rPr>
-          <w:rFonts w:ascii="TH Sarabun New" w:eastAsia="Times New Roman" w:hAnsi="TH Sarabun New" w:cs="TH Sarabun New"/>
-          <w:color w:val="000000" w:themeColor="text1"/>
-          <w:sz w:val="32"/>
-          <w:szCs w:val="32"/>
-          <w:cs/>
-          <w:lang w:eastAsia="en-GB"/>
-        </w:rPr>
-        <w:t>/</w:t>
-      </w:r>
-      <w:r>
-        <w:rPr>
-          <w:rFonts w:ascii="TH Sarabun New" w:eastAsia="Times New Roman" w:hAnsi="TH Sarabun New" w:cs="TH Sarabun New"/>
-          <w:color w:val="000000" w:themeColor="text1"/>
-          <w:sz w:val="32"/>
-          <w:szCs w:val="32"/>
-          <w:lang w:eastAsia="en-GB"/>
-        </w:rPr>
-        <w:t>{{</w:t>
+        <w:t>  {{</w:t>
       </w:r>
       <w:proofErr w:type="spellStart"/>
       <w:r>
@@ -1146,6 +1062,16 @@
           <w:lang w:val="en-US" w:eastAsia="en-GB"/>
         </w:rPr>
         <w:t xml:space="preserve">}} </w:t>
+      </w:r>
+      <w:r>
+        <w:rPr>
+          <w:rFonts w:ascii="TH Sarabun New" w:eastAsia="Times New Roman" w:hAnsi="TH Sarabun New" w:cs="TH Sarabun New"/>
+          <w:color w:val="000000" w:themeColor="text1"/>
+          <w:sz w:val="32"/>
+          <w:szCs w:val="32"/>
+          <w:lang w:val="en-US" w:eastAsia="en-GB"/>
+        </w:rPr>
+        <w:t xml:space="preserve"> </w:t>
       </w:r>
       <w:r>
         <w:rPr>
@@ -1730,7 +1656,7 @@
 </file>
 
 <file path=word/endnotes.xml><?xml version="1.0" encoding="utf-8"?>
-<w:endnotes xmlns:wpc="http://schemas.microsoft.com/office/word/2010/wordprocessingCanvas" xmlns:cx="http://schemas.microsoft.com/office/drawing/2014/chartex" xmlns:cx1="http://schemas.microsoft.com/office/drawing/2015/9/8/chartex" xmlns:cx2="http://schemas.microsoft.com/office/drawing/2015/10/21/chartex" xmlns:cx3="http://schemas.microsoft.com/office/drawing/2016/5/9/chartex" xmlns:cx4="http://schemas.microsoft.com/office/drawing/2016/5/10/chartex" xmlns:cx5="http://schemas.microsoft.com/office/drawing/2016/5/11/chartex" xmlns:cx6="http://schemas.microsoft.com/office/drawing/2016/5/12/chartex" xmlns:cx7="http://schemas.microsoft.com/office/drawing/2016/5/13/chartex" xmlns:cx8="http://schemas.microsoft.com/office/drawing/2016/5/14/chartex" xmlns:mc="http://schemas.openxmlformats.org/markup-compatibility/2006" xmlns:m="http://schemas.openxmlformats.org/officeDocument/2006/math" xmlns:aink="http://schemas.microsoft.com/office/drawing/2016/ink" xmlns:am3d="http://schemas.microsoft.com/office/drawing/2017/model3d" xmlns:oel="http://schemas.microsoft.com/office/2019/extlst" xmlns:r="http://schemas.openxmlformats.org/officeDocument/2006/relationships" xmlns:wp14="http://schemas.microsoft.com/office/word/2010/wordprocessingDrawing" xmlns:wp="http://schemas.openxmlformats.org/drawingml/2006/wordprocessingDrawing" xmlns:wpg="http://schemas.microsoft.com/office/word/2010/wordprocessingGroup" xmlns:wpi="http://schemas.microsoft.com/office/word/2010/wordprocessingInk" xmlns:wps="http://schemas.microsoft.com/office/word/2010/wordprocessingShape" xmlns:o="urn:schemas-microsoft-com:office:office" xmlns:v="urn:schemas-microsoft-com:vml" xmlns:w10="urn:schemas-microsoft-com:office:word" xmlns:w="http://schemas.openxmlformats.org/wordprocessingml/2006/main" xmlns:w14="http://schemas.microsoft.com/office/word/2010/wordml" xmlns:w15="http://schemas.microsoft.com/office/word/2012/wordml" xmlns:w16cex="http://schemas.microsoft.com/office/word/2018/wordml/cex" xmlns:w16cid="http://schemas.microsoft.com/office/word/2016/wordml/cid" xmlns:w16="http://schemas.microsoft.com/office/word/2018/wordml" xmlns:w16sdtdh="http://schemas.microsoft.com/office/word/2020/wordml/sdtdatahash" xmlns:w16sdtfl="http://schemas.microsoft.com/office/word/2024/wordml/sdtformatlock" xmlns:w16se="http://schemas.microsoft.com/office/word/2015/wordml/symex" xmlns:w16du="http://schemas.microsoft.com/office/word/2023/wordml/word16du" xmlns:wne="http://schemas.microsoft.com/office/word/2006/wordml" mc:Ignorable="w14 w15 w16se w16cid w16 w16cex w16sdtdh w16sdtfl w16du wp14">
+<w:endnotes xmlns:wpc="http://schemas.microsoft.com/office/word/2010/wordprocessingCanvas" xmlns:cx="http://schemas.microsoft.com/office/drawing/2014/chartex" xmlns:cx1="http://schemas.microsoft.com/office/drawing/2015/9/8/chartex" xmlns:cx2="http://schemas.microsoft.com/office/drawing/2015/10/21/chartex" xmlns:cx3="http://schemas.microsoft.com/office/drawing/2016/5/9/chartex" xmlns:cx4="http://schemas.microsoft.com/office/drawing/2016/5/10/chartex" xmlns:cx5="http://schemas.microsoft.com/office/drawing/2016/5/11/chartex" xmlns:cx6="http://schemas.microsoft.com/office/drawing/2016/5/12/chartex" xmlns:cx7="http://schemas.microsoft.com/office/drawing/2016/5/13/chartex" xmlns:cx8="http://schemas.microsoft.com/office/drawing/2016/5/14/chartex" xmlns:mc="http://schemas.openxmlformats.org/markup-compatibility/2006" xmlns:aink="http://schemas.microsoft.com/office/drawing/2016/ink" xmlns:am3d="http://schemas.microsoft.com/office/drawing/2017/model3d" xmlns:o="urn:schemas-microsoft-com:office:office" xmlns:oel="http://schemas.microsoft.com/office/2019/extlst" xmlns:r="http://schemas.openxmlformats.org/officeDocument/2006/relationships" xmlns:m="http://schemas.openxmlformats.org/officeDocument/2006/math" xmlns:v="urn:schemas-microsoft-com:vml" xmlns:wp14="http://schemas.microsoft.com/office/word/2010/wordprocessingDrawing" xmlns:wp="http://schemas.openxmlformats.org/drawingml/2006/wordprocessingDrawing" xmlns:w10="urn:schemas-microsoft-com:office:word" xmlns:w="http://schemas.openxmlformats.org/wordprocessingml/2006/main" xmlns:w14="http://schemas.microsoft.com/office/word/2010/wordml" xmlns:w15="http://schemas.microsoft.com/office/word/2012/wordml" xmlns:w16cex="http://schemas.microsoft.com/office/word/2018/wordml/cex" xmlns:w16cid="http://schemas.microsoft.com/office/word/2016/wordml/cid" xmlns:w16="http://schemas.microsoft.com/office/word/2018/wordml" xmlns:w16du="http://schemas.microsoft.com/office/word/2023/wordml/word16du" xmlns:w16sdtdh="http://schemas.microsoft.com/office/word/2020/wordml/sdtdatahash" xmlns:w16sdtfl="http://schemas.microsoft.com/office/word/2024/wordml/sdtformatlock" xmlns:w16se="http://schemas.microsoft.com/office/word/2015/wordml/symex" xmlns:wpg="http://schemas.microsoft.com/office/word/2010/wordprocessingGroup" xmlns:wpi="http://schemas.microsoft.com/office/word/2010/wordprocessingInk" xmlns:wne="http://schemas.microsoft.com/office/word/2006/wordml" xmlns:wps="http://schemas.microsoft.com/office/word/2010/wordprocessingShape" mc:Ignorable="w14 w15 w16se w16cid w16 w16cex w16sdtdh w16sdtfl w16du wp14">
   <w:endnote w:type="separator" w:id="-1">
     <w:p>
       <w:r>
@@ -1749,7 +1675,7 @@
 </file>
 
 <file path=word/footnotes.xml><?xml version="1.0" encoding="utf-8"?>
-<w:footnotes xmlns:wpc="http://schemas.microsoft.com/office/word/2010/wordprocessingCanvas" xmlns:cx="http://schemas.microsoft.com/office/drawing/2014/chartex" xmlns:cx1="http://schemas.microsoft.com/office/drawing/2015/9/8/chartex" xmlns:cx2="http://schemas.microsoft.com/office/drawing/2015/10/21/chartex" xmlns:cx3="http://schemas.microsoft.com/office/drawing/2016/5/9/chartex" xmlns:cx4="http://schemas.microsoft.com/office/drawing/2016/5/10/chartex" xmlns:cx5="http://schemas.microsoft.com/office/drawing/2016/5/11/chartex" xmlns:cx6="http://schemas.microsoft.com/office/drawing/2016/5/12/chartex" xmlns:cx7="http://schemas.microsoft.com/office/drawing/2016/5/13/chartex" xmlns:cx8="http://schemas.microsoft.com/office/drawing/2016/5/14/chartex" xmlns:mc="http://schemas.openxmlformats.org/markup-compatibility/2006" xmlns:m="http://schemas.openxmlformats.org/officeDocument/2006/math" xmlns:aink="http://schemas.microsoft.com/office/drawing/2016/ink" xmlns:am3d="http://schemas.microsoft.com/office/drawing/2017/model3d" xmlns:oel="http://schemas.microsoft.com/office/2019/extlst" xmlns:r="http://schemas.openxmlformats.org/officeDocument/2006/relationships" xmlns:wp14="http://schemas.microsoft.com/office/word/2010/wordprocessingDrawing" xmlns:wp="http://schemas.openxmlformats.org/drawingml/2006/wordprocessingDrawing" xmlns:wpg="http://schemas.microsoft.com/office/word/2010/wordprocessingGroup" xmlns:wpi="http://schemas.microsoft.com/office/word/2010/wordprocessingInk" xmlns:wps="http://schemas.microsoft.com/office/word/2010/wordprocessingShape" xmlns:o="urn:schemas-microsoft-com:office:office" xmlns:v="urn:schemas-microsoft-com:vml" xmlns:w10="urn:schemas-microsoft-com:office:word" xmlns:w="http://schemas.openxmlformats.org/wordprocessingml/2006/main" xmlns:w14="http://schemas.microsoft.com/office/word/2010/wordml" xmlns:w15="http://schemas.microsoft.com/office/word/2012/wordml" xmlns:w16cex="http://schemas.microsoft.com/office/word/2018/wordml/cex" xmlns:w16cid="http://schemas.microsoft.com/office/word/2016/wordml/cid" xmlns:w16="http://schemas.microsoft.com/office/word/2018/wordml" xmlns:w16sdtdh="http://schemas.microsoft.com/office/word/2020/wordml/sdtdatahash" xmlns:w16sdtfl="http://schemas.microsoft.com/office/word/2024/wordml/sdtformatlock" xmlns:w16se="http://schemas.microsoft.com/office/word/2015/wordml/symex" xmlns:w16du="http://schemas.microsoft.com/office/word/2023/wordml/word16du" xmlns:wne="http://schemas.microsoft.com/office/word/2006/wordml" mc:Ignorable="w14 w15 w16se w16cid w16 w16cex w16sdtdh w16sdtfl w16du wp14">
+<w:footnotes xmlns:wpc="http://schemas.microsoft.com/office/word/2010/wordprocessingCanvas" xmlns:cx="http://schemas.microsoft.com/office/drawing/2014/chartex" xmlns:cx1="http://schemas.microsoft.com/office/drawing/2015/9/8/chartex" xmlns:cx2="http://schemas.microsoft.com/office/drawing/2015/10/21/chartex" xmlns:cx3="http://schemas.microsoft.com/office/drawing/2016/5/9/chartex" xmlns:cx4="http://schemas.microsoft.com/office/drawing/2016/5/10/chartex" xmlns:cx5="http://schemas.microsoft.com/office/drawing/2016/5/11/chartex" xmlns:cx6="http://schemas.microsoft.com/office/drawing/2016/5/12/chartex" xmlns:cx7="http://schemas.microsoft.com/office/drawing/2016/5/13/chartex" xmlns:cx8="http://schemas.microsoft.com/office/drawing/2016/5/14/chartex" xmlns:mc="http://schemas.openxmlformats.org/markup-compatibility/2006" xmlns:aink="http://schemas.microsoft.com/office/drawing/2016/ink" xmlns:am3d="http://schemas.microsoft.com/office/drawing/2017/model3d" xmlns:o="urn:schemas-microsoft-com:office:office" xmlns:oel="http://schemas.microsoft.com/office/2019/extlst" xmlns:r="http://schemas.openxmlformats.org/officeDocument/2006/relationships" xmlns:m="http://schemas.openxmlformats.org/officeDocument/2006/math" xmlns:v="urn:schemas-microsoft-com:vml" xmlns:wp14="http://schemas.microsoft.com/office/word/2010/wordprocessingDrawing" xmlns:wp="http://schemas.openxmlformats.org/drawingml/2006/wordprocessingDrawing" xmlns:w10="urn:schemas-microsoft-com:office:word" xmlns:w="http://schemas.openxmlformats.org/wordprocessingml/2006/main" xmlns:w14="http://schemas.microsoft.com/office/word/2010/wordml" xmlns:w15="http://schemas.microsoft.com/office/word/2012/wordml" xmlns:w16cex="http://schemas.microsoft.com/office/word/2018/wordml/cex" xmlns:w16cid="http://schemas.microsoft.com/office/word/2016/wordml/cid" xmlns:w16="http://schemas.microsoft.com/office/word/2018/wordml" xmlns:w16du="http://schemas.microsoft.com/office/word/2023/wordml/word16du" xmlns:w16sdtdh="http://schemas.microsoft.com/office/word/2020/wordml/sdtdatahash" xmlns:w16sdtfl="http://schemas.microsoft.com/office/word/2024/wordml/sdtformatlock" xmlns:w16se="http://schemas.microsoft.com/office/word/2015/wordml/symex" xmlns:wpg="http://schemas.microsoft.com/office/word/2010/wordprocessingGroup" xmlns:wpi="http://schemas.microsoft.com/office/word/2010/wordprocessingInk" xmlns:wne="http://schemas.microsoft.com/office/word/2006/wordml" xmlns:wps="http://schemas.microsoft.com/office/word/2010/wordprocessingShape" mc:Ignorable="w14 w15 w16se w16cid w16 w16cex w16sdtdh w16sdtfl w16du wp14">
   <w:footnote w:type="separator" w:id="-1">
     <w:p>
       <w:r>
@@ -1768,7 +1694,7 @@
 </file>
 
 <file path=word/styles.xml><?xml version="1.0" encoding="utf-8"?>
-<w:styles xmlns:mc="http://schemas.openxmlformats.org/markup-compatibility/2006" xmlns:r="http://schemas.openxmlformats.org/officeDocument/2006/relationships" xmlns:w="http://schemas.openxmlformats.org/wordprocessingml/2006/main" xmlns:w14="http://schemas.microsoft.com/office/word/2010/wordml" xmlns:w15="http://schemas.microsoft.com/office/word/2012/wordml" xmlns:w16cex="http://schemas.microsoft.com/office/word/2018/wordml/cex" xmlns:w16cid="http://schemas.microsoft.com/office/word/2016/wordml/cid" xmlns:w16="http://schemas.microsoft.com/office/word/2018/wordml" xmlns:w16sdtdh="http://schemas.microsoft.com/office/word/2020/wordml/sdtdatahash" xmlns:w16sdtfl="http://schemas.microsoft.com/office/word/2024/wordml/sdtformatlock" xmlns:w16se="http://schemas.microsoft.com/office/word/2015/wordml/symex" xmlns:w16du="http://schemas.microsoft.com/office/word/2023/wordml/word16du" mc:Ignorable="w14 w15 w16se w16cid w16 w16cex w16sdtdh w16sdtfl w16du">
+<w:styles xmlns:mc="http://schemas.openxmlformats.org/markup-compatibility/2006" xmlns:r="http://schemas.openxmlformats.org/officeDocument/2006/relationships" xmlns:w="http://schemas.openxmlformats.org/wordprocessingml/2006/main" xmlns:w14="http://schemas.microsoft.com/office/word/2010/wordml" xmlns:w15="http://schemas.microsoft.com/office/word/2012/wordml" xmlns:w16cex="http://schemas.microsoft.com/office/word/2018/wordml/cex" xmlns:w16cid="http://schemas.microsoft.com/office/word/2016/wordml/cid" xmlns:w16="http://schemas.microsoft.com/office/word/2018/wordml" xmlns:w16du="http://schemas.microsoft.com/office/word/2023/wordml/word16du" xmlns:w16sdtdh="http://schemas.microsoft.com/office/word/2020/wordml/sdtdatahash" xmlns:w16sdtfl="http://schemas.microsoft.com/office/word/2024/wordml/sdtformatlock" xmlns:w16se="http://schemas.microsoft.com/office/word/2015/wordml/symex" mc:Ignorable="w14 w15 w16se w16cid w16 w16cex w16sdtdh w16sdtfl w16du">
   <w:docDefaults>
     <w:rPrDefault>
       <w:rPr>

</xml_diff>